<commit_message>
List every CV section in reverse chronological order
Reorders academic positions, professional experience, publications,
awards, teaching, and service newest-first, and right-aligns the
professional experience dates to match the other sections.

Co-Authored-By: Claude Opus 5.5 <noreply@anthropic.com>
</commit_message>
<xml_diff>
--- a/Yifat Aran CV 2026 October 18.docx
+++ b/Yifat Aran CV 2026 October 18.docx
@@ -343,23 +343,14 @@
           <w:bCs/>
           <w:color w:val="000000" w:themeColor="text1"/>
         </w:rPr>
-        <w:t xml:space="preserve">Assistant </w:t>
-      </w:r>
-      <w:r>
-        <w:rPr>
-          <w:rFonts w:ascii="Garamond" w:hAnsi="Garamond"/>
-          <w:b/>
-          <w:bCs/>
-          <w:color w:val="000000" w:themeColor="text1"/>
-        </w:rPr>
-        <w:t>Professor</w:t>
-      </w:r>
-      <w:r>
-        <w:rPr>
-          <w:rFonts w:ascii="Garamond" w:hAnsi="Garamond"/>
-          <w:color w:val="000000" w:themeColor="text1"/>
-        </w:rPr>
-        <w:t>, University of Haifa, Faculty of Law</w:t>
+        <w:t>Visiting Scholar</w:t>
+      </w:r>
+      <w:r>
+        <w:rPr>
+          <w:rFonts w:ascii="Garamond" w:hAnsi="Garamond"/>
+          <w:color w:val="000000" w:themeColor="text1"/>
+        </w:rPr>
+        <w:t>, Stanford University, Law School</w:t>
       </w:r>
       <w:r>
         <w:rPr>
@@ -367,7 +358,7 @@
           <w:color w:val="000000" w:themeColor="text1"/>
         </w:rPr>
         <w:tab/>
-        <w:t>2021–present</w:t>
+        <w:t>2026–2027</w:t>
       </w:r>
     </w:p>
     <w:p>
@@ -431,14 +422,23 @@
           <w:bCs/>
           <w:color w:val="000000" w:themeColor="text1"/>
         </w:rPr>
-        <w:t>Visiting Scholar</w:t>
-      </w:r>
-      <w:r>
-        <w:rPr>
-          <w:rFonts w:ascii="Garamond" w:hAnsi="Garamond"/>
-          <w:color w:val="000000" w:themeColor="text1"/>
-        </w:rPr>
-        <w:t>, Stanford University, Law School</w:t>
+        <w:t xml:space="preserve">Assistant </w:t>
+      </w:r>
+      <w:r>
+        <w:rPr>
+          <w:rFonts w:ascii="Garamond" w:hAnsi="Garamond"/>
+          <w:b/>
+          <w:bCs/>
+          <w:color w:val="000000" w:themeColor="text1"/>
+        </w:rPr>
+        <w:t>Professor</w:t>
+      </w:r>
+      <w:r>
+        <w:rPr>
+          <w:rFonts w:ascii="Garamond" w:hAnsi="Garamond"/>
+          <w:color w:val="000000" w:themeColor="text1"/>
+        </w:rPr>
+        <w:t>, University of Haifa, Faculty of Law</w:t>
       </w:r>
       <w:r>
         <w:rPr>
@@ -446,7 +446,7 @@
           <w:color w:val="000000" w:themeColor="text1"/>
         </w:rPr>
         <w:tab/>
-        <w:t>2026–2027</w:t>
+        <w:t>2021–present</w:t>
       </w:r>
     </w:p>
     <w:p>
@@ -555,7 +555,7 @@
           <w:rFonts w:ascii="Garamond" w:hAnsi="Garamond"/>
           <w:color w:val="000000" w:themeColor="text1"/>
         </w:rPr>
-        <w:t>Law Clerk to Chief Justice Dorit Beinisch, Supreme Court of Israel 2010–2011</w:t>
+        <w:t xml:space="preserve">Lawyer, Litigation Department, Abramson &amp; Co., Jerusalem</w:t>
       </w:r>
       <w:r>
         <w:rPr>
@@ -563,45 +563,7 @@
           <w:color w:val="000000" w:themeColor="text1"/>
         </w:rPr>
         <w:tab/>
-      </w:r>
-    </w:p>
-    <w:p>
-      <w:pPr>
-        <w:spacing w:after="50"/>
-        <w:rPr>
-          <w:rFonts w:ascii="Garamond" w:hAnsi="Garamond"/>
-          <w:color w:val="000000" w:themeColor="text1"/>
-        </w:rPr>
-      </w:pPr>
-      <w:r>
-        <w:rPr>
-          <w:rFonts w:ascii="Garamond" w:hAnsi="Garamond"/>
-          <w:color w:val="000000" w:themeColor="text1"/>
-        </w:rPr>
-        <w:t xml:space="preserve">Member, Israel Bar Association, </w:t>
-      </w:r>
-      <w:r>
-        <w:rPr>
-          <w:rFonts w:ascii="Garamond" w:hAnsi="Garamond"/>
-          <w:color w:val="000000" w:themeColor="text1"/>
-        </w:rPr>
-        <w:t>2011–present</w:t>
-      </w:r>
-      <w:r>
-        <w:rPr>
-          <w:rFonts w:ascii="Garamond" w:hAnsi="Garamond"/>
-          <w:b/>
-          <w:bCs/>
-          <w:color w:val="000000" w:themeColor="text1"/>
-        </w:rPr>
-        <w:t xml:space="preserve">  </w:t>
-      </w:r>
-      <w:r>
-        <w:rPr>
-          <w:rFonts w:ascii="Garamond" w:hAnsi="Garamond"/>
-          <w:color w:val="000000" w:themeColor="text1"/>
-        </w:rPr>
-        <w:tab/>
+        <w:t>2012–2015</w:t>
       </w:r>
     </w:p>
     <w:p>
@@ -620,7 +582,7 @@
           <w:rFonts w:ascii="Garamond" w:hAnsi="Garamond"/>
           <w:color w:val="000000" w:themeColor="text1"/>
         </w:rPr>
-        <w:t>Senior Law Clerk to Chief Justice Dr. Asher Grunis, Supreme Court of Israel 2012</w:t>
+        <w:t xml:space="preserve">Senior Law Clerk to Chief Justice Dr. Asher Grunis, Supreme Court of Israel</w:t>
       </w:r>
       <w:r>
         <w:rPr>
@@ -628,6 +590,7 @@
           <w:color w:val="000000" w:themeColor="text1"/>
         </w:rPr>
         <w:tab/>
+        <w:t>2012</w:t>
       </w:r>
     </w:p>
     <w:p>
@@ -646,21 +609,42 @@
           <w:rFonts w:ascii="Garamond" w:hAnsi="Garamond"/>
           <w:color w:val="000000" w:themeColor="text1"/>
         </w:rPr>
-        <w:t>Lawyer, Litigation Department, Abramson &amp; Co., Jerusalem 201</w:t>
-      </w:r>
-      <w:r>
-        <w:rPr>
-          <w:rFonts w:ascii="Garamond" w:hAnsi="Garamond"/>
-          <w:color w:val="000000" w:themeColor="text1"/>
-        </w:rPr>
-        <w:t>2</w:t>
-      </w:r>
-      <w:r>
-        <w:rPr>
-          <w:rFonts w:ascii="Garamond" w:hAnsi="Garamond"/>
-          <w:color w:val="000000" w:themeColor="text1"/>
-        </w:rPr>
-        <w:t>–2015</w:t>
+        <w:t xml:space="preserve">Member, Israel Bar Association</w:t>
+      </w:r>
+      <w:r>
+        <w:rPr>
+          <w:rFonts w:ascii="Garamond" w:hAnsi="Garamond"/>
+          <w:color w:val="000000" w:themeColor="text1"/>
+        </w:rPr>
+        <w:tab/>
+        <w:t>2011–present</w:t>
+      </w:r>
+    </w:p>
+    <w:p>
+      <w:pPr>
+        <w:tabs>
+          <w:tab w:val="right" w:pos="9026"/>
+        </w:tabs>
+        <w:spacing w:after="60"/>
+        <w:rPr>
+          <w:rFonts w:ascii="Garamond" w:hAnsi="Garamond"/>
+          <w:color w:val="000000" w:themeColor="text1"/>
+        </w:rPr>
+      </w:pPr>
+      <w:r>
+        <w:rPr>
+          <w:rFonts w:ascii="Garamond" w:hAnsi="Garamond"/>
+          <w:color w:val="000000" w:themeColor="text1"/>
+        </w:rPr>
+        <w:t xml:space="preserve">Law Clerk to Chief Justice Dorit Beinisch, Supreme Court of Israel</w:t>
+      </w:r>
+      <w:r>
+        <w:rPr>
+          <w:rFonts w:ascii="Garamond" w:hAnsi="Garamond"/>
+          <w:color w:val="000000" w:themeColor="text1"/>
+        </w:rPr>
+        <w:tab/>
+        <w:t>2010–2011</w:t>
       </w:r>
     </w:p>
     <w:p>
@@ -732,6 +716,325 @@
           <w:color w:val="000000" w:themeColor="text1"/>
         </w:rPr>
         <w:t>Articles in Refereed Journals and Law Reviews</w:t>
+      </w:r>
+    </w:p>
+    <w:p>
+      <w:pPr>
+        <w:pStyle w:val="ListParagraph"/>
+        <w:numPr>
+          <w:ilvl w:val="0"/>
+          <w:numId w:val="2"/>
+        </w:numPr>
+        <w:spacing w:after="120"/>
+        <w:rPr>
+          <w:rFonts w:ascii="Garamond" w:hAnsi="Garamond"/>
+          <w:color w:val="000000" w:themeColor="text1"/>
+        </w:rPr>
+      </w:pPr>
+      <w:r>
+        <w:rPr>
+          <w:rFonts w:ascii="Garamond" w:hAnsi="Garamond"/>
+          <w:b/>
+          <w:bCs/>
+          <w:color w:val="000000" w:themeColor="text1"/>
+        </w:rPr>
+        <w:t xml:space="preserve">Yifat Aran</w:t>
+      </w:r>
+      <w:r>
+        <w:rPr>
+          <w:rFonts w:ascii="Garamond" w:hAnsi="Garamond"/>
+          <w:color w:val="000000" w:themeColor="text1"/>
+        </w:rPr>
+        <w:t xml:space="preserve">, </w:t>
+      </w:r>
+      <w:r>
+        <w:rPr>
+          <w:rFonts w:ascii="Garamond" w:hAnsi="Garamond"/>
+          <w:i/>
+          <w:iCs/>
+          <w:color w:val="000000" w:themeColor="text1"/>
+        </w:rPr>
+        <w:t xml:space="preserve">The Optional Firm: The Silicon Valley Model of Startup Organization</w:t>
+      </w:r>
+      <w:r>
+        <w:rPr>
+          <w:rFonts w:ascii="Garamond" w:hAnsi="Garamond"/>
+          <w:color w:val="000000" w:themeColor="text1"/>
+        </w:rPr>
+        <w:t xml:space="preserve"> (forthcoming, </w:t>
+      </w:r>
+      <w:r>
+        <w:rPr>
+          <w:rFonts w:ascii="Garamond" w:hAnsi="Garamond"/>
+          <w:smallCaps/>
+          <w:color w:val="000000" w:themeColor="text1"/>
+        </w:rPr>
+        <w:t xml:space="preserve">European Business Organization Law Review</w:t>
+      </w:r>
+      <w:r>
+        <w:rPr>
+          <w:rFonts w:ascii="Garamond" w:hAnsi="Garamond"/>
+          <w:color w:val="000000" w:themeColor="text1"/>
+        </w:rPr>
+        <w:t xml:space="preserve">).</w:t>
+      </w:r>
+    </w:p>
+    <w:p>
+      <w:pPr>
+        <w:pStyle w:val="ListParagraph"/>
+        <w:numPr>
+          <w:ilvl w:val="0"/>
+          <w:numId w:val="2"/>
+        </w:numPr>
+        <w:spacing w:after="120"/>
+        <w:rPr>
+          <w:rFonts w:ascii="Garamond" w:hAnsi="Garamond"/>
+          <w:color w:val="000000" w:themeColor="text1"/>
+        </w:rPr>
+      </w:pPr>
+      <w:r>
+        <w:rPr>
+          <w:rFonts w:ascii="Garamond" w:hAnsi="Garamond"/>
+          <w:b/>
+          <w:bCs/>
+          <w:color w:val="000000" w:themeColor="text1"/>
+        </w:rPr>
+        <w:t>Yifat Aran</w:t>
+      </w:r>
+      <w:r>
+        <w:rPr>
+          <w:rFonts w:ascii="Garamond" w:hAnsi="Garamond"/>
+          <w:color w:val="000000" w:themeColor="text1"/>
+        </w:rPr>
+        <w:t xml:space="preserve">, Brian Broughman, and Elizabeth Pollman, </w:t>
+      </w:r>
+      <w:r>
+        <w:rPr>
+          <w:rFonts w:ascii="Garamond" w:hAnsi="Garamond"/>
+          <w:i/>
+          <w:iCs/>
+          <w:color w:val="000000" w:themeColor="text1"/>
+        </w:rPr>
+        <w:t>Exit after Exit</w:t>
+      </w:r>
+      <w:r>
+        <w:rPr>
+          <w:rFonts w:ascii="Garamond" w:hAnsi="Garamond"/>
+          <w:color w:val="000000" w:themeColor="text1"/>
+        </w:rPr>
+        <w:t xml:space="preserve"> (forthcoming, Harvard Business Law Review</w:t>
+      </w:r>
+      <w:r>
+        <w:rPr>
+          <w:rFonts w:ascii="Garamond" w:hAnsi="Garamond"/>
+          <w:color w:val="000000" w:themeColor="text1"/>
+        </w:rPr>
+        <w:t xml:space="preserve"> 2027</w:t>
+      </w:r>
+      <w:r>
+        <w:rPr>
+          <w:rFonts w:ascii="Garamond" w:hAnsi="Garamond"/>
+          <w:color w:val="000000" w:themeColor="text1"/>
+        </w:rPr>
+        <w:t xml:space="preserve">). </w:t>
+      </w:r>
+    </w:p>
+    <w:p>
+      <w:pPr>
+        <w:pStyle w:val="ListParagraph"/>
+        <w:numPr>
+          <w:ilvl w:val="0"/>
+          <w:numId w:val="2"/>
+        </w:numPr>
+        <w:spacing w:after="120"/>
+        <w:rPr>
+          <w:rFonts w:ascii="Garamond" w:hAnsi="Garamond"/>
+          <w:color w:val="000000" w:themeColor="text1"/>
+        </w:rPr>
+      </w:pPr>
+      <w:r>
+        <w:rPr>
+          <w:rFonts w:ascii="Garamond" w:hAnsi="Garamond"/>
+          <w:b/>
+          <w:bCs/>
+          <w:color w:val="000000" w:themeColor="text1"/>
+        </w:rPr>
+        <w:t>Yifat Aran</w:t>
+      </w:r>
+      <w:r>
+        <w:rPr>
+          <w:rFonts w:ascii="Garamond" w:hAnsi="Garamond"/>
+          <w:color w:val="000000" w:themeColor="text1"/>
+        </w:rPr>
+        <w:t xml:space="preserve">, Brian Broughman, and Elizabeth Pollman, </w:t>
+      </w:r>
+      <w:r>
+        <w:rPr>
+          <w:rFonts w:ascii="Garamond" w:hAnsi="Garamond"/>
+          <w:i/>
+          <w:iCs/>
+          <w:color w:val="000000" w:themeColor="text1"/>
+        </w:rPr>
+        <w:t>CEO Turnover at Dual-Class Firms</w:t>
+      </w:r>
+      <w:r>
+        <w:rPr>
+          <w:rFonts w:ascii="Garamond" w:hAnsi="Garamond"/>
+          <w:color w:val="000000" w:themeColor="text1"/>
+        </w:rPr>
+        <w:t xml:space="preserve"> (forthcoming, </w:t>
+      </w:r>
+      <w:r>
+        <w:rPr>
+          <w:rFonts w:ascii="Garamond" w:hAnsi="Garamond"/>
+          <w:smallCaps/>
+          <w:color w:val="000000" w:themeColor="text1"/>
+        </w:rPr>
+        <w:t>Journal of Legal Studies</w:t>
+      </w:r>
+      <w:r>
+        <w:rPr>
+          <w:rFonts w:ascii="Garamond" w:hAnsi="Garamond"/>
+          <w:color w:val="000000" w:themeColor="text1"/>
+        </w:rPr>
+        <w:t xml:space="preserve"> 2026).</w:t>
+      </w:r>
+    </w:p>
+    <w:p>
+      <w:pPr>
+        <w:pStyle w:val="ListParagraph"/>
+        <w:numPr>
+          <w:ilvl w:val="0"/>
+          <w:numId w:val="2"/>
+        </w:numPr>
+        <w:spacing w:after="120"/>
+        <w:rPr>
+          <w:rFonts w:ascii="Garamond" w:hAnsi="Garamond"/>
+          <w:color w:val="000000" w:themeColor="text1"/>
+        </w:rPr>
+      </w:pPr>
+      <w:r>
+        <w:rPr>
+          <w:rFonts w:ascii="Garamond" w:hAnsi="Garamond"/>
+          <w:color w:val="000000" w:themeColor="text1"/>
+        </w:rPr>
+        <w:t xml:space="preserve">Gad Weiss, Kobi Ben Chitrit, and </w:t>
+      </w:r>
+      <w:r>
+        <w:rPr>
+          <w:rFonts w:ascii="Garamond" w:hAnsi="Garamond"/>
+          <w:b/>
+          <w:bCs/>
+          <w:color w:val="000000" w:themeColor="text1"/>
+        </w:rPr>
+        <w:t>Yifat Aran</w:t>
+      </w:r>
+      <w:r>
+        <w:rPr>
+          <w:rFonts w:ascii="Garamond" w:hAnsi="Garamond"/>
+          <w:color w:val="000000" w:themeColor="text1"/>
+        </w:rPr>
+        <w:t xml:space="preserve">, </w:t>
+      </w:r>
+      <w:r>
+        <w:rPr>
+          <w:rFonts w:ascii="Garamond" w:hAnsi="Garamond"/>
+          <w:i/>
+          <w:iCs/>
+          <w:color w:val="000000" w:themeColor="text1"/>
+        </w:rPr>
+        <w:t>Let it Go: A Comparative Perspective on the Enforceability of Pay-to-Play Provisions</w:t>
+      </w:r>
+      <w:r>
+        <w:rPr>
+          <w:rFonts w:ascii="Garamond" w:hAnsi="Garamond"/>
+          <w:color w:val="000000" w:themeColor="text1"/>
+        </w:rPr>
+        <w:t xml:space="preserve"> [in Hebrew] (forthcoming, </w:t>
+      </w:r>
+      <w:r>
+        <w:rPr>
+          <w:rFonts w:ascii="Garamond" w:hAnsi="Garamond"/>
+          <w:smallCaps/>
+          <w:color w:val="000000" w:themeColor="text1"/>
+        </w:rPr>
+        <w:t>TAU Law Review</w:t>
+      </w:r>
+      <w:r>
+        <w:rPr>
+          <w:rFonts w:ascii="Garamond" w:hAnsi="Garamond"/>
+          <w:color w:val="000000" w:themeColor="text1"/>
+        </w:rPr>
+        <w:t xml:space="preserve"> 2026).</w:t>
+      </w:r>
+    </w:p>
+    <w:p>
+      <w:pPr>
+        <w:pStyle w:val="ListParagraph"/>
+        <w:numPr>
+          <w:ilvl w:val="0"/>
+          <w:numId w:val="2"/>
+        </w:numPr>
+        <w:spacing w:after="120"/>
+        <w:rPr>
+          <w:rFonts w:ascii="Garamond" w:hAnsi="Garamond"/>
+          <w:color w:val="000000" w:themeColor="text1"/>
+        </w:rPr>
+      </w:pPr>
+      <w:r>
+        <w:rPr>
+          <w:rFonts w:ascii="Garamond" w:hAnsi="Garamond"/>
+          <w:b/>
+          <w:bCs/>
+          <w:color w:val="000000" w:themeColor="text1"/>
+        </w:rPr>
+        <w:t>Yifat Aran</w:t>
+      </w:r>
+      <w:r>
+        <w:rPr>
+          <w:rFonts w:ascii="Garamond" w:hAnsi="Garamond"/>
+          <w:color w:val="000000" w:themeColor="text1"/>
+        </w:rPr>
+        <w:t xml:space="preserve">, </w:t>
+      </w:r>
+      <w:r>
+        <w:rPr>
+          <w:rFonts w:ascii="Garamond" w:hAnsi="Garamond"/>
+          <w:i/>
+          <w:iCs/>
+          <w:color w:val="000000" w:themeColor="text1"/>
+        </w:rPr>
+        <w:t>Shared Capitalism at a Crossroads: Equity Compensation and Factor Bargaining Power in the Innovation Economy</w:t>
+      </w:r>
+      <w:r>
+        <w:rPr>
+          <w:rFonts w:ascii="Garamond" w:hAnsi="Garamond"/>
+          <w:color w:val="000000" w:themeColor="text1"/>
+        </w:rPr>
+        <w:t xml:space="preserve">, </w:t>
+      </w:r>
+      <w:r>
+        <w:rPr>
+          <w:rFonts w:ascii="Garamond" w:hAnsi="Garamond"/>
+          <w:smallCaps/>
+          <w:color w:val="000000" w:themeColor="text1"/>
+        </w:rPr>
+        <w:t>International Review of Applied Economics</w:t>
+      </w:r>
+      <w:r>
+        <w:rPr>
+          <w:rFonts w:ascii="Garamond" w:hAnsi="Garamond"/>
+          <w:smallCaps/>
+          <w:color w:val="000000" w:themeColor="text1"/>
+        </w:rPr>
+        <w:t xml:space="preserve"> 1–18</w:t>
+      </w:r>
+      <w:r>
+        <w:rPr>
+          <w:rFonts w:ascii="Garamond" w:hAnsi="Garamond"/>
+          <w:color w:val="000000" w:themeColor="text1"/>
+        </w:rPr>
+        <w:t xml:space="preserve"> (2026). </w:t>
       </w:r>
     </w:p>
     <w:p>
@@ -761,7 +1064,7 @@
           <w:rFonts w:ascii="Garamond" w:hAnsi="Garamond"/>
           <w:color w:val="000000" w:themeColor="text1"/>
         </w:rPr>
-        <w:t xml:space="preserve">, </w:t>
+        <w:t xml:space="preserve"> &amp; Nizan Geslevich Packin, </w:t>
       </w:r>
       <w:r>
         <w:rPr>
@@ -770,14 +1073,14 @@
           <w:iCs/>
           <w:color w:val="000000" w:themeColor="text1"/>
         </w:rPr>
-        <w:t>Beyond Covenants Not to Compete: Equilibrium in High-Tech Start-Up Labor Markets</w:t>
-      </w:r>
-      <w:r>
-        <w:rPr>
-          <w:rFonts w:ascii="Garamond" w:hAnsi="Garamond"/>
-          <w:color w:val="000000" w:themeColor="text1"/>
-        </w:rPr>
-        <w:t xml:space="preserve">, 70(4) </w:t>
+        <w:t>Due Diligence Dilemma</w:t>
+      </w:r>
+      <w:r>
+        <w:rPr>
+          <w:rFonts w:ascii="Garamond" w:hAnsi="Garamond"/>
+          <w:color w:val="000000" w:themeColor="text1"/>
+        </w:rPr>
+        <w:t xml:space="preserve">, 2025(4) </w:t>
       </w:r>
       <w:r>
         <w:rPr>
@@ -785,14 +1088,14 @@
           <w:smallCaps/>
           <w:color w:val="000000" w:themeColor="text1"/>
         </w:rPr>
-        <w:t>Stanford Law Review</w:t>
-      </w:r>
-      <w:r>
-        <w:rPr>
-          <w:rFonts w:ascii="Garamond" w:hAnsi="Garamond"/>
-          <w:color w:val="000000" w:themeColor="text1"/>
-        </w:rPr>
-        <w:t xml:space="preserve"> 1235–1294 (2018).</w:t>
+        <w:t>University of Illinois Law Review</w:t>
+      </w:r>
+      <w:r>
+        <w:rPr>
+          <w:rFonts w:ascii="Garamond" w:hAnsi="Garamond"/>
+          <w:color w:val="000000" w:themeColor="text1"/>
+        </w:rPr>
+        <w:t xml:space="preserve"> 101–144 (2025).</w:t>
       </w:r>
     </w:p>
     <w:p>
@@ -813,28 +1116,7 @@
           <w:sz w:val="20"/>
           <w:szCs w:val="20"/>
         </w:rPr>
-        <w:t>Winner of the John Hart Ely Prize in Law and Economics and the Intellectual Property Writing Award, Stanford Law School.</w:t>
-      </w:r>
-    </w:p>
-    <w:p>
-      <w:pPr>
-        <w:spacing w:after="120"/>
-        <w:ind w:left="720"/>
-        <w:rPr>
-          <w:rFonts w:ascii="Garamond" w:hAnsi="Garamond"/>
-          <w:color w:val="000000" w:themeColor="text1"/>
-        </w:rPr>
-      </w:pPr>
-      <w:r>
-        <w:rPr>
-          <w:rFonts w:ascii="Garamond" w:hAnsi="Garamond"/>
-          <w:i/>
-          <w:iCs/>
-          <w:color w:val="000000" w:themeColor="text1"/>
-          <w:sz w:val="20"/>
-          <w:szCs w:val="20"/>
-        </w:rPr>
-        <w:t xml:space="preserve">Featured on The Indicator from Planet Money (NPR), June 2026.</w:t>
+        <w:t>Featured in the CLS Blue Sky Blog.</w:t>
       </w:r>
     </w:p>
     <w:p>
@@ -864,7 +1146,7 @@
           <w:rFonts w:ascii="Garamond" w:hAnsi="Garamond"/>
           <w:color w:val="000000" w:themeColor="text1"/>
         </w:rPr>
-        <w:t xml:space="preserve">, </w:t>
+        <w:t xml:space="preserve"> &amp; Raviv Murciano-Goroff, </w:t>
       </w:r>
       <w:r>
         <w:rPr>
@@ -873,14 +1155,14 @@
           <w:iCs/>
           <w:color w:val="000000" w:themeColor="text1"/>
         </w:rPr>
-        <w:t>Making Disclosure Work for Start-Up Employees</w:t>
-      </w:r>
-      <w:r>
-        <w:rPr>
-          <w:rFonts w:ascii="Garamond" w:hAnsi="Garamond"/>
-          <w:color w:val="000000" w:themeColor="text1"/>
-        </w:rPr>
-        <w:t xml:space="preserve">, 2019(3) </w:t>
+        <w:t>Equity Illusions</w:t>
+      </w:r>
+      <w:r>
+        <w:rPr>
+          <w:rFonts w:ascii="Garamond" w:hAnsi="Garamond"/>
+          <w:color w:val="000000" w:themeColor="text1"/>
+        </w:rPr>
+        <w:t xml:space="preserve">, 41(1) </w:t>
       </w:r>
       <w:r>
         <w:rPr>
@@ -888,14 +1170,14 @@
           <w:smallCaps/>
           <w:color w:val="000000" w:themeColor="text1"/>
         </w:rPr>
-        <w:t>Columbia Business Law Review</w:t>
-      </w:r>
-      <w:r>
-        <w:rPr>
-          <w:rFonts w:ascii="Garamond" w:hAnsi="Garamond"/>
-          <w:color w:val="000000" w:themeColor="text1"/>
-        </w:rPr>
-        <w:t xml:space="preserve"> 867–963 (2019).</w:t>
+        <w:t>Journal of Law, Economics, &amp; Organization</w:t>
+      </w:r>
+      <w:r>
+        <w:rPr>
+          <w:rFonts w:ascii="Garamond" w:hAnsi="Garamond"/>
+          <w:color w:val="000000" w:themeColor="text1"/>
+        </w:rPr>
+        <w:t xml:space="preserve"> 196–238 (2025).</w:t>
       </w:r>
     </w:p>
     <w:p>
@@ -916,7 +1198,7 @@
           <w:sz w:val="20"/>
           <w:szCs w:val="20"/>
         </w:rPr>
-        <w:t>Featured in Forbes, TechCrunch, and Business Law Prof Blog.</w:t>
+        <w:t>Winner of the 2024 AOM Employee Participation and Financial Ownership Scholarly Research Award. Featured in The New York Times, Globes, TheMarker, and Tech12.</w:t>
       </w:r>
     </w:p>
     <w:p>
@@ -946,7 +1228,7 @@
           <w:rFonts w:ascii="Garamond" w:hAnsi="Garamond"/>
           <w:color w:val="000000" w:themeColor="text1"/>
         </w:rPr>
-        <w:t xml:space="preserve">, </w:t>
+        <w:t xml:space="preserve"> &amp; Elizabeth Pollman, </w:t>
       </w:r>
       <w:r>
         <w:rPr>
@@ -955,14 +1237,14 @@
           <w:iCs/>
           <w:color w:val="000000" w:themeColor="text1"/>
         </w:rPr>
-        <w:t>The Startup Law of the Startup Nation</w:t>
-      </w:r>
-      <w:r>
-        <w:rPr>
-          <w:rFonts w:ascii="Garamond" w:hAnsi="Garamond"/>
-          <w:color w:val="000000" w:themeColor="text1"/>
-        </w:rPr>
-        <w:t xml:space="preserve"> [in Hebrew], 53 </w:t>
+        <w:t>Ousted</w:t>
+      </w:r>
+      <w:r>
+        <w:rPr>
+          <w:rFonts w:ascii="Garamond" w:hAnsi="Garamond"/>
+          <w:color w:val="000000" w:themeColor="text1"/>
+        </w:rPr>
+        <w:t xml:space="preserve">, 25(1) </w:t>
       </w:r>
       <w:r>
         <w:rPr>
@@ -970,14 +1252,14 @@
           <w:smallCaps/>
           <w:color w:val="000000" w:themeColor="text1"/>
         </w:rPr>
-        <w:t>Mishpatim Law Review</w:t>
-      </w:r>
-      <w:r>
-        <w:rPr>
-          <w:rFonts w:ascii="Garamond" w:hAnsi="Garamond"/>
-          <w:color w:val="000000" w:themeColor="text1"/>
-        </w:rPr>
-        <w:t xml:space="preserve"> 115–183 (2024).</w:t>
+        <w:t>Theoretical Inquiries in Law</w:t>
+      </w:r>
+      <w:r>
+        <w:rPr>
+          <w:rFonts w:ascii="Garamond" w:hAnsi="Garamond"/>
+          <w:color w:val="000000" w:themeColor="text1"/>
+        </w:rPr>
+        <w:t xml:space="preserve"> 231–263 (2024).</w:t>
       </w:r>
     </w:p>
     <w:p>
@@ -998,7 +1280,7 @@
           <w:sz w:val="20"/>
           <w:szCs w:val="20"/>
         </w:rPr>
-        <w:t>Cited by the Economic Division of the Tel Aviv District Court in CA 41875-01-20 Kaminski v. Ravid (2023), CA 29021-08-20 Tzur v. Empirical Hire (2023), and CA 17248-05-19 TechnoPlus Ventures v. Bioville (2023).</w:t>
+        <w:t>Featured in the Chancery Daily, the Harvard Law School Forum on Corporate Governance, the Boardroom Governance Podcast, and the Boardroom Governance Newsletter.</w:t>
       </w:r>
     </w:p>
     <w:p>
@@ -1028,7 +1310,7 @@
           <w:rFonts w:ascii="Garamond" w:hAnsi="Garamond"/>
           <w:color w:val="000000" w:themeColor="text1"/>
         </w:rPr>
-        <w:t xml:space="preserve"> &amp; Elizabeth Pollman, </w:t>
+        <w:t xml:space="preserve">, </w:t>
       </w:r>
       <w:r>
         <w:rPr>
@@ -1037,14 +1319,14 @@
           <w:iCs/>
           <w:color w:val="000000" w:themeColor="text1"/>
         </w:rPr>
-        <w:t>Ousted</w:t>
-      </w:r>
-      <w:r>
-        <w:rPr>
-          <w:rFonts w:ascii="Garamond" w:hAnsi="Garamond"/>
-          <w:color w:val="000000" w:themeColor="text1"/>
-        </w:rPr>
-        <w:t xml:space="preserve">, 25(1) </w:t>
+        <w:t>The Startup Law of the Startup Nation</w:t>
+      </w:r>
+      <w:r>
+        <w:rPr>
+          <w:rFonts w:ascii="Garamond" w:hAnsi="Garamond"/>
+          <w:color w:val="000000" w:themeColor="text1"/>
+        </w:rPr>
+        <w:t xml:space="preserve"> [in Hebrew], 53 </w:t>
       </w:r>
       <w:r>
         <w:rPr>
@@ -1052,14 +1334,14 @@
           <w:smallCaps/>
           <w:color w:val="000000" w:themeColor="text1"/>
         </w:rPr>
-        <w:t>Theoretical Inquiries in Law</w:t>
-      </w:r>
-      <w:r>
-        <w:rPr>
-          <w:rFonts w:ascii="Garamond" w:hAnsi="Garamond"/>
-          <w:color w:val="000000" w:themeColor="text1"/>
-        </w:rPr>
-        <w:t xml:space="preserve"> 231–263 (2024).</w:t>
+        <w:t>Mishpatim Law Review</w:t>
+      </w:r>
+      <w:r>
+        <w:rPr>
+          <w:rFonts w:ascii="Garamond" w:hAnsi="Garamond"/>
+          <w:color w:val="000000" w:themeColor="text1"/>
+        </w:rPr>
+        <w:t xml:space="preserve"> 115–183 (2024).</w:t>
       </w:r>
     </w:p>
     <w:p>
@@ -1080,7 +1362,7 @@
           <w:sz w:val="20"/>
           <w:szCs w:val="20"/>
         </w:rPr>
-        <w:t>Featured in the Chancery Daily, the Harvard Law School Forum on Corporate Governance, the Boardroom Governance Podcast, and the Boardroom Governance Newsletter.</w:t>
+        <w:t>Cited by the Economic Division of the Tel Aviv District Court in CA 41875-01-20 Kaminski v. Ravid (2023), CA 29021-08-20 Tzur v. Empirical Hire (2023), and CA 17248-05-19 TechnoPlus Ventures v. Bioville (2023).</w:t>
       </w:r>
     </w:p>
     <w:p>
@@ -1110,7 +1392,7 @@
           <w:rFonts w:ascii="Garamond" w:hAnsi="Garamond"/>
           <w:color w:val="000000" w:themeColor="text1"/>
         </w:rPr>
-        <w:t xml:space="preserve"> &amp; Raviv Murciano-Goroff, </w:t>
+        <w:t xml:space="preserve">, </w:t>
       </w:r>
       <w:r>
         <w:rPr>
@@ -1119,14 +1401,14 @@
           <w:iCs/>
           <w:color w:val="000000" w:themeColor="text1"/>
         </w:rPr>
-        <w:t>Equity Illusions</w:t>
-      </w:r>
-      <w:r>
-        <w:rPr>
-          <w:rFonts w:ascii="Garamond" w:hAnsi="Garamond"/>
-          <w:color w:val="000000" w:themeColor="text1"/>
-        </w:rPr>
-        <w:t xml:space="preserve">, 41(1) </w:t>
+        <w:t>Making Disclosure Work for Start-Up Employees</w:t>
+      </w:r>
+      <w:r>
+        <w:rPr>
+          <w:rFonts w:ascii="Garamond" w:hAnsi="Garamond"/>
+          <w:color w:val="000000" w:themeColor="text1"/>
+        </w:rPr>
+        <w:t xml:space="preserve">, 2019(3) </w:t>
       </w:r>
       <w:r>
         <w:rPr>
@@ -1134,14 +1416,14 @@
           <w:smallCaps/>
           <w:color w:val="000000" w:themeColor="text1"/>
         </w:rPr>
-        <w:t>Journal of Law, Economics, &amp; Organization</w:t>
-      </w:r>
-      <w:r>
-        <w:rPr>
-          <w:rFonts w:ascii="Garamond" w:hAnsi="Garamond"/>
-          <w:color w:val="000000" w:themeColor="text1"/>
-        </w:rPr>
-        <w:t xml:space="preserve"> 196–238 (2025).</w:t>
+        <w:t>Columbia Business Law Review</w:t>
+      </w:r>
+      <w:r>
+        <w:rPr>
+          <w:rFonts w:ascii="Garamond" w:hAnsi="Garamond"/>
+          <w:color w:val="000000" w:themeColor="text1"/>
+        </w:rPr>
+        <w:t xml:space="preserve"> 867–963 (2019).</w:t>
       </w:r>
     </w:p>
     <w:p>
@@ -1162,7 +1444,7 @@
           <w:sz w:val="20"/>
           <w:szCs w:val="20"/>
         </w:rPr>
-        <w:t>Winner of the 2024 AOM Employee Participation and Financial Ownership Scholarly Research Award. Featured in The New York Times, Globes, TheMarker, and Tech12.</w:t>
+        <w:t>Featured in Forbes, TechCrunch, and Business Law Prof Blog.</w:t>
       </w:r>
     </w:p>
     <w:p>
@@ -1192,7 +1474,7 @@
           <w:rFonts w:ascii="Garamond" w:hAnsi="Garamond"/>
           <w:color w:val="000000" w:themeColor="text1"/>
         </w:rPr>
-        <w:t xml:space="preserve"> &amp; Nizan Geslevich Packin, </w:t>
+        <w:t xml:space="preserve">, </w:t>
       </w:r>
       <w:r>
         <w:rPr>
@@ -1201,14 +1483,14 @@
           <w:iCs/>
           <w:color w:val="000000" w:themeColor="text1"/>
         </w:rPr>
-        <w:t>Due Diligence Dilemma</w:t>
-      </w:r>
-      <w:r>
-        <w:rPr>
-          <w:rFonts w:ascii="Garamond" w:hAnsi="Garamond"/>
-          <w:color w:val="000000" w:themeColor="text1"/>
-        </w:rPr>
-        <w:t xml:space="preserve">, 2025(4) </w:t>
+        <w:t>Beyond Covenants Not to Compete: Equilibrium in High-Tech Start-Up Labor Markets</w:t>
+      </w:r>
+      <w:r>
+        <w:rPr>
+          <w:rFonts w:ascii="Garamond" w:hAnsi="Garamond"/>
+          <w:color w:val="000000" w:themeColor="text1"/>
+        </w:rPr>
+        <w:t xml:space="preserve">, 70(4) </w:t>
       </w:r>
       <w:r>
         <w:rPr>
@@ -1216,14 +1498,14 @@
           <w:smallCaps/>
           <w:color w:val="000000" w:themeColor="text1"/>
         </w:rPr>
-        <w:t>University of Illinois Law Review</w:t>
-      </w:r>
-      <w:r>
-        <w:rPr>
-          <w:rFonts w:ascii="Garamond" w:hAnsi="Garamond"/>
-          <w:color w:val="000000" w:themeColor="text1"/>
-        </w:rPr>
-        <w:t xml:space="preserve"> 101–144 (2025).</w:t>
+        <w:t>Stanford Law Review</w:t>
+      </w:r>
+      <w:r>
+        <w:rPr>
+          <w:rFonts w:ascii="Garamond" w:hAnsi="Garamond"/>
+          <w:color w:val="000000" w:themeColor="text1"/>
+        </w:rPr>
+        <w:t xml:space="preserve"> 1235–1294 (2018).</w:t>
       </w:r>
     </w:p>
     <w:p>
@@ -1244,325 +1526,28 @@
           <w:sz w:val="20"/>
           <w:szCs w:val="20"/>
         </w:rPr>
-        <w:t>Featured in the CLS Blue Sky Blog.</w:t>
-      </w:r>
-    </w:p>
-    <w:p>
-      <w:pPr>
-        <w:pStyle w:val="ListParagraph"/>
-        <w:numPr>
-          <w:ilvl w:val="0"/>
-          <w:numId w:val="2"/>
-        </w:numPr>
+        <w:t>Winner of the John Hart Ely Prize in Law and Economics and the Intellectual Property Writing Award, Stanford Law School.</w:t>
+      </w:r>
+    </w:p>
+    <w:p>
+      <w:pPr>
         <w:spacing w:after="120"/>
-        <w:rPr>
-          <w:rFonts w:ascii="Garamond" w:hAnsi="Garamond"/>
-          <w:color w:val="000000" w:themeColor="text1"/>
-        </w:rPr>
-      </w:pPr>
-      <w:r>
-        <w:rPr>
-          <w:rFonts w:ascii="Garamond" w:hAnsi="Garamond"/>
-          <w:color w:val="000000" w:themeColor="text1"/>
-        </w:rPr>
-        <w:t xml:space="preserve">Gad Weiss, Kobi Ben Chitrit, and </w:t>
-      </w:r>
-      <w:r>
-        <w:rPr>
-          <w:rFonts w:ascii="Garamond" w:hAnsi="Garamond"/>
-          <w:b/>
-          <w:bCs/>
-          <w:color w:val="000000" w:themeColor="text1"/>
-        </w:rPr>
-        <w:t>Yifat Aran</w:t>
-      </w:r>
-      <w:r>
-        <w:rPr>
-          <w:rFonts w:ascii="Garamond" w:hAnsi="Garamond"/>
-          <w:color w:val="000000" w:themeColor="text1"/>
-        </w:rPr>
-        <w:t xml:space="preserve">, </w:t>
-      </w:r>
+        <w:ind w:left="720"/>
+        <w:rPr>
+          <w:rFonts w:ascii="Garamond" w:hAnsi="Garamond"/>
+          <w:color w:val="000000" w:themeColor="text1"/>
+        </w:rPr>
+      </w:pPr>
       <w:r>
         <w:rPr>
           <w:rFonts w:ascii="Garamond" w:hAnsi="Garamond"/>
           <w:i/>
           <w:iCs/>
           <w:color w:val="000000" w:themeColor="text1"/>
-        </w:rPr>
-        <w:t>Let it Go: A Comparative Perspective on the Enforceability of Pay-to-Play Provisions</w:t>
-      </w:r>
-      <w:r>
-        <w:rPr>
-          <w:rFonts w:ascii="Garamond" w:hAnsi="Garamond"/>
-          <w:color w:val="000000" w:themeColor="text1"/>
-        </w:rPr>
-        <w:t xml:space="preserve"> [in Hebrew] (forthcoming, </w:t>
-      </w:r>
-      <w:r>
-        <w:rPr>
-          <w:rFonts w:ascii="Garamond" w:hAnsi="Garamond"/>
-          <w:smallCaps/>
-          <w:color w:val="000000" w:themeColor="text1"/>
-        </w:rPr>
-        <w:t>TAU Law Review</w:t>
-      </w:r>
-      <w:r>
-        <w:rPr>
-          <w:rFonts w:ascii="Garamond" w:hAnsi="Garamond"/>
-          <w:color w:val="000000" w:themeColor="text1"/>
-        </w:rPr>
-        <w:t xml:space="preserve"> 2026).</w:t>
-      </w:r>
-    </w:p>
-    <w:p>
-      <w:pPr>
-        <w:pStyle w:val="ListParagraph"/>
-        <w:numPr>
-          <w:ilvl w:val="0"/>
-          <w:numId w:val="2"/>
-        </w:numPr>
-        <w:spacing w:after="160" w:line="259" w:lineRule="auto"/>
-        <w:rPr>
-          <w:rFonts w:asciiTheme="majorBidi" w:hAnsiTheme="majorBidi" w:cstheme="majorBidi"/>
-        </w:rPr>
-      </w:pPr>
-      <w:r>
-        <w:rPr>
-          <w:rFonts w:ascii="Garamond" w:hAnsi="Garamond"/>
-          <w:b/>
-          <w:bCs/>
-          <w:color w:val="000000" w:themeColor="text1"/>
-        </w:rPr>
-        <w:t>Yifat Aran</w:t>
-      </w:r>
-      <w:r>
-        <w:rPr>
-          <w:rFonts w:ascii="Garamond" w:hAnsi="Garamond"/>
-          <w:color w:val="000000" w:themeColor="text1"/>
-        </w:rPr>
-        <w:t xml:space="preserve">, </w:t>
-      </w:r>
-      <w:r>
-        <w:rPr>
-          <w:rFonts w:ascii="Garamond" w:hAnsi="Garamond"/>
-          <w:i/>
-          <w:iCs/>
-          <w:color w:val="000000" w:themeColor="text1"/>
-        </w:rPr>
-        <w:t>Shared Capitalism at a Crossroads: Equity Compensation and Factor Bargaining Power in the Innovation Economy</w:t>
-      </w:r>
-      <w:r>
-        <w:rPr>
-          <w:rFonts w:ascii="Garamond" w:hAnsi="Garamond"/>
-          <w:color w:val="000000" w:themeColor="text1"/>
-        </w:rPr>
-        <w:t xml:space="preserve">, </w:t>
-      </w:r>
-      <w:r>
-        <w:rPr>
-          <w:rFonts w:ascii="Garamond" w:hAnsi="Garamond"/>
-          <w:smallCaps/>
-          <w:color w:val="000000" w:themeColor="text1"/>
-        </w:rPr>
-        <w:t>International Review of Applied Economics</w:t>
-      </w:r>
-      <w:r>
-        <w:rPr>
-          <w:rFonts w:ascii="Garamond" w:hAnsi="Garamond"/>
-          <w:smallCaps/>
-          <w:color w:val="000000" w:themeColor="text1"/>
-        </w:rPr>
-        <w:t xml:space="preserve"> 1–18</w:t>
-      </w:r>
-      <w:r>
-        <w:rPr>
-          <w:rFonts w:ascii="Garamond" w:hAnsi="Garamond"/>
-          <w:color w:val="000000" w:themeColor="text1"/>
-        </w:rPr>
-        <w:t xml:space="preserve"> (2026). </w:t>
-      </w:r>
-    </w:p>
-    <w:p>
-      <w:pPr>
-        <w:pStyle w:val="ListParagraph"/>
-        <w:numPr>
-          <w:ilvl w:val="0"/>
-          <w:numId w:val="2"/>
-        </w:numPr>
-        <w:spacing w:after="80"/>
-        <w:rPr>
-          <w:rFonts w:ascii="Garamond" w:hAnsi="Garamond"/>
-          <w:color w:val="000000" w:themeColor="text1"/>
-        </w:rPr>
-      </w:pPr>
-      <w:r>
-        <w:rPr>
-          <w:rFonts w:ascii="Garamond" w:hAnsi="Garamond"/>
-          <w:b/>
-          <w:bCs/>
-          <w:color w:val="000000" w:themeColor="text1"/>
-        </w:rPr>
-        <w:t>Yifat Aran</w:t>
-      </w:r>
-      <w:r>
-        <w:rPr>
-          <w:rFonts w:ascii="Garamond" w:hAnsi="Garamond"/>
-          <w:color w:val="000000" w:themeColor="text1"/>
-        </w:rPr>
-        <w:t xml:space="preserve">, Brian Broughman, and Elizabeth Pollman, </w:t>
-      </w:r>
-      <w:r>
-        <w:rPr>
-          <w:rFonts w:ascii="Garamond" w:hAnsi="Garamond"/>
-          <w:i/>
-          <w:iCs/>
-          <w:color w:val="000000" w:themeColor="text1"/>
-        </w:rPr>
-        <w:t>CEO Turnover at Dual-Class Firms</w:t>
-      </w:r>
-      <w:r>
-        <w:rPr>
-          <w:rFonts w:ascii="Garamond" w:hAnsi="Garamond"/>
-          <w:color w:val="000000" w:themeColor="text1"/>
-        </w:rPr>
-        <w:t xml:space="preserve"> (forthcoming, </w:t>
-      </w:r>
-      <w:r>
-        <w:rPr>
-          <w:rFonts w:ascii="Garamond" w:hAnsi="Garamond"/>
-          <w:smallCaps/>
-          <w:color w:val="000000" w:themeColor="text1"/>
-        </w:rPr>
-        <w:t>Journal of Legal Studies</w:t>
-      </w:r>
-      <w:r>
-        <w:rPr>
-          <w:rFonts w:ascii="Garamond" w:hAnsi="Garamond"/>
-          <w:color w:val="000000" w:themeColor="text1"/>
-        </w:rPr>
-        <w:t xml:space="preserve"> 2026).</w:t>
-      </w:r>
-    </w:p>
-    <w:p>
-      <w:pPr>
-        <w:pStyle w:val="ListParagraph"/>
-        <w:numPr>
-          <w:ilvl w:val="0"/>
-          <w:numId w:val="2"/>
-        </w:numPr>
-        <w:spacing w:after="80"/>
-        <w:rPr>
-          <w:rFonts w:ascii="Garamond" w:hAnsi="Garamond"/>
-          <w:color w:val="000000" w:themeColor="text1"/>
-        </w:rPr>
-      </w:pPr>
-      <w:r>
-        <w:rPr>
-          <w:rFonts w:ascii="Garamond" w:hAnsi="Garamond"/>
-          <w:b/>
-          <w:bCs/>
-          <w:color w:val="000000" w:themeColor="text1"/>
-        </w:rPr>
-        <w:t>Yifat Aran</w:t>
-      </w:r>
-      <w:r>
-        <w:rPr>
-          <w:rFonts w:ascii="Garamond" w:hAnsi="Garamond"/>
-          <w:color w:val="000000" w:themeColor="text1"/>
-        </w:rPr>
-        <w:t xml:space="preserve">, Brian Broughman, and Elizabeth Pollman, </w:t>
-      </w:r>
-      <w:r>
-        <w:rPr>
-          <w:rFonts w:ascii="Garamond" w:hAnsi="Garamond"/>
-          <w:i/>
-          <w:iCs/>
-          <w:color w:val="000000" w:themeColor="text1"/>
-        </w:rPr>
-        <w:t>Exit after Exit</w:t>
-      </w:r>
-      <w:r>
-        <w:rPr>
-          <w:rFonts w:ascii="Garamond" w:hAnsi="Garamond"/>
-          <w:color w:val="000000" w:themeColor="text1"/>
-        </w:rPr>
-        <w:t xml:space="preserve"> (forthcoming, Harvard Business Law Review</w:t>
-      </w:r>
-      <w:r>
-        <w:rPr>
-          <w:rFonts w:ascii="Garamond" w:hAnsi="Garamond"/>
-          <w:color w:val="000000" w:themeColor="text1"/>
-        </w:rPr>
-        <w:t xml:space="preserve"> 2027</w:t>
-      </w:r>
-      <w:r>
-        <w:rPr>
-          <w:rFonts w:ascii="Garamond" w:hAnsi="Garamond"/>
-          <w:color w:val="000000" w:themeColor="text1"/>
-        </w:rPr>
-        <w:t xml:space="preserve">). </w:t>
-      </w:r>
-    </w:p>
-    <w:p>
-      <w:pPr>
-        <w:pStyle w:val="ListParagraph"/>
-        <w:numPr>
-          <w:ilvl w:val="0"/>
-          <w:numId w:val="2"/>
-        </w:numPr>
-        <w:spacing w:after="80"/>
-        <w:rPr>
-          <w:rFonts w:ascii="Garamond" w:hAnsi="Garamond"/>
-          <w:color w:val="000000" w:themeColor="text1"/>
-        </w:rPr>
-      </w:pPr>
-      <w:r>
-        <w:rPr>
-          <w:rFonts w:ascii="Garamond" w:hAnsi="Garamond"/>
-          <w:b/>
-          <w:bCs/>
-          <w:color w:val="000000" w:themeColor="text1"/>
-        </w:rPr>
-        <w:t xml:space="preserve">Yifat Aran</w:t>
-      </w:r>
-      <w:r>
-        <w:rPr>
-          <w:rFonts w:ascii="Garamond" w:hAnsi="Garamond"/>
-          <w:color w:val="000000" w:themeColor="text1"/>
-        </w:rPr>
-        <w:t xml:space="preserve">, </w:t>
-      </w:r>
-      <w:r>
-        <w:rPr>
-          <w:rFonts w:ascii="Garamond" w:hAnsi="Garamond"/>
-          <w:i/>
-          <w:iCs/>
-          <w:color w:val="000000" w:themeColor="text1"/>
-        </w:rPr>
-        <w:t xml:space="preserve">The Optional Firm: The Silicon Valley Model of Startup Organization</w:t>
-      </w:r>
-      <w:r>
-        <w:rPr>
-          <w:rFonts w:ascii="Garamond" w:hAnsi="Garamond"/>
-          <w:color w:val="000000" w:themeColor="text1"/>
-        </w:rPr>
-        <w:t xml:space="preserve"> (forthcoming, </w:t>
-      </w:r>
-      <w:r>
-        <w:rPr>
-          <w:rFonts w:ascii="Garamond" w:hAnsi="Garamond"/>
-          <w:smallCaps/>
-          <w:color w:val="000000" w:themeColor="text1"/>
-        </w:rPr>
-        <w:t xml:space="preserve">European Business Organization Law Review</w:t>
-      </w:r>
-      <w:r>
-        <w:rPr>
-          <w:rFonts w:ascii="Garamond" w:hAnsi="Garamond"/>
-          <w:color w:val="000000" w:themeColor="text1"/>
-        </w:rPr>
-        <w:t xml:space="preserve">).</w:t>
+          <w:sz w:val="20"/>
+          <w:szCs w:val="20"/>
+        </w:rPr>
+        <w:t xml:space="preserve">Featured on The Indicator from Planet Money (NPR), June 2026.</w:t>
       </w:r>
     </w:p>
     <w:p>
@@ -1610,7 +1595,7 @@
           <w:rFonts w:ascii="Garamond" w:hAnsi="Garamond"/>
           <w:color w:val="000000" w:themeColor="text1"/>
         </w:rPr>
-        <w:t xml:space="preserve"> &amp; Moran Ofir, </w:t>
+        <w:t xml:space="preserve">, </w:t>
       </w:r>
       <w:r>
         <w:rPr>
@@ -1619,7 +1604,7 @@
           <w:iCs/>
           <w:color w:val="000000" w:themeColor="text1"/>
         </w:rPr>
-        <w:t>The Effect of Specialised Courts over Time</w:t>
+        <w:t>The RSU Time Bomb: Regulating Startup Equity Compensation in the Unicorn Era</w:t>
       </w:r>
       <w:r>
         <w:rPr>
@@ -1634,35 +1619,14 @@
           <w:smallCaps/>
           <w:color w:val="000000" w:themeColor="text1"/>
         </w:rPr>
-        <w:t>Time, Law and Change: An Interdisciplinary Study</w:t>
-      </w:r>
-      <w:r>
-        <w:rPr>
-          <w:rFonts w:ascii="Garamond" w:hAnsi="Garamond"/>
-          <w:color w:val="000000" w:themeColor="text1"/>
-        </w:rPr>
-        <w:t xml:space="preserve"> 167–188 (Sofia Ranchordas &amp; Yaniv Roznai eds., Hart Publishing, 2020).</w:t>
-      </w:r>
-    </w:p>
-    <w:p>
-      <w:pPr>
-        <w:spacing w:after="120"/>
-        <w:ind w:left="720"/>
-        <w:rPr>
-          <w:rFonts w:ascii="Garamond" w:hAnsi="Garamond"/>
-          <w:color w:val="000000" w:themeColor="text1"/>
-        </w:rPr>
-      </w:pPr>
-      <w:r>
-        <w:rPr>
-          <w:rFonts w:ascii="Garamond" w:hAnsi="Garamond"/>
-          <w:i/>
-          <w:iCs/>
-          <w:color w:val="000000" w:themeColor="text1"/>
-          <w:sz w:val="20"/>
-          <w:szCs w:val="20"/>
-        </w:rPr>
-        <w:t>Earlier draft cited by the Economic Division in Tel Aviv District Court in CA 5136-07-21 Hagshama v. Wisner (2021).</w:t>
+        <w:t>Research Handbook on PE/VC</w:t>
+      </w:r>
+      <w:r>
+        <w:rPr>
+          <w:rFonts w:ascii="Garamond" w:hAnsi="Garamond"/>
+          <w:color w:val="000000" w:themeColor="text1"/>
+        </w:rPr>
+        <w:t xml:space="preserve"> (Brian Broughman &amp; Elisabeth de Fontenay eds., 2026).</w:t>
       </w:r>
     </w:p>
     <w:p>
@@ -1692,7 +1656,7 @@
           <w:rFonts w:ascii="Garamond" w:hAnsi="Garamond"/>
           <w:color w:val="000000" w:themeColor="text1"/>
         </w:rPr>
-        <w:t xml:space="preserve">, </w:t>
+        <w:t xml:space="preserve"> &amp; Moran Ofir, </w:t>
       </w:r>
       <w:r>
         <w:rPr>
@@ -1701,7 +1665,7 @@
           <w:iCs/>
           <w:color w:val="000000" w:themeColor="text1"/>
         </w:rPr>
-        <w:t>The RSU Time Bomb: Regulating Startup Equity Compensation in the Unicorn Era</w:t>
+        <w:t>The Effect of Specialised Courts over Time</w:t>
       </w:r>
       <w:r>
         <w:rPr>
@@ -1716,14 +1680,35 @@
           <w:smallCaps/>
           <w:color w:val="000000" w:themeColor="text1"/>
         </w:rPr>
-        <w:t>Research Handbook on PE/VC</w:t>
-      </w:r>
-      <w:r>
-        <w:rPr>
-          <w:rFonts w:ascii="Garamond" w:hAnsi="Garamond"/>
-          <w:color w:val="000000" w:themeColor="text1"/>
-        </w:rPr>
-        <w:t xml:space="preserve"> (Brian Broughman &amp; Elisabeth de Fontenay eds., 2026).</w:t>
+        <w:t>Time, Law and Change: An Interdisciplinary Study</w:t>
+      </w:r>
+      <w:r>
+        <w:rPr>
+          <w:rFonts w:ascii="Garamond" w:hAnsi="Garamond"/>
+          <w:color w:val="000000" w:themeColor="text1"/>
+        </w:rPr>
+        <w:t xml:space="preserve"> 167–188 (Sofia Ranchordas &amp; Yaniv Roznai eds., Hart Publishing, 2020).</w:t>
+      </w:r>
+    </w:p>
+    <w:p>
+      <w:pPr>
+        <w:spacing w:after="120"/>
+        <w:ind w:left="720"/>
+        <w:rPr>
+          <w:rFonts w:ascii="Garamond" w:hAnsi="Garamond"/>
+          <w:color w:val="000000" w:themeColor="text1"/>
+        </w:rPr>
+      </w:pPr>
+      <w:r>
+        <w:rPr>
+          <w:rFonts w:ascii="Garamond" w:hAnsi="Garamond"/>
+          <w:i/>
+          <w:iCs/>
+          <w:color w:val="000000" w:themeColor="text1"/>
+          <w:sz w:val="20"/>
+          <w:szCs w:val="20"/>
+        </w:rPr>
+        <w:t>Earlier draft cited by the Economic Division in Tel Aviv District Court in CA 5136-07-21 Hagshama v. Wisner (2021).</w:t>
       </w:r>
     </w:p>
     <w:p>
@@ -1854,14 +1839,14 @@
           <w:iCs/>
           <w:color w:val="000000" w:themeColor="text1"/>
         </w:rPr>
-        <w:t>The SEC should do more to make startup equity compensation transparent</w:t>
-      </w:r>
-      <w:r>
-        <w:rPr>
-          <w:rFonts w:ascii="Garamond" w:hAnsi="Garamond"/>
-          <w:color w:val="000000" w:themeColor="text1"/>
-        </w:rPr>
-        <w:t>, TechCrunch (April 24, 2021).</w:t>
+        <w:t>What Brazil Reveals About the Limits of Venture Capital Contract Transplants</w:t>
+      </w:r>
+      <w:r>
+        <w:rPr>
+          <w:rFonts w:ascii="Garamond" w:hAnsi="Garamond"/>
+          <w:color w:val="000000" w:themeColor="text1"/>
+        </w:rPr>
+        <w:t>, ECGI Blog (April 27, 2026).</w:t>
       </w:r>
     </w:p>
     <w:p>
@@ -1891,7 +1876,7 @@
           <w:rFonts w:ascii="Garamond" w:hAnsi="Garamond"/>
           <w:color w:val="000000" w:themeColor="text1"/>
         </w:rPr>
-        <w:t xml:space="preserve">, </w:t>
+        <w:t xml:space="preserve"> &amp; Casimiro Nigro, </w:t>
       </w:r>
       <w:r>
         <w:rPr>
@@ -1900,75 +1885,14 @@
           <w:iCs/>
           <w:color w:val="000000" w:themeColor="text1"/>
         </w:rPr>
-        <w:t>A new coalition for “Open Cap Table” presents an opportunity for equity transparency</w:t>
-      </w:r>
-      <w:r>
-        <w:rPr>
-          <w:rFonts w:ascii="Garamond" w:hAnsi="Garamond"/>
-          <w:color w:val="000000" w:themeColor="text1"/>
-        </w:rPr>
-        <w:t>, TechCrunch (August 29, 2021).</w:t>
-      </w:r>
-    </w:p>
-    <w:p>
-      <w:pPr>
-        <w:pStyle w:val="ListParagraph"/>
-        <w:numPr>
-          <w:ilvl w:val="0"/>
-          <w:numId w:val="4"/>
-        </w:numPr>
-        <w:spacing w:after="120"/>
-        <w:rPr>
-          <w:rFonts w:ascii="Garamond" w:hAnsi="Garamond"/>
-          <w:color w:val="000000" w:themeColor="text1"/>
-        </w:rPr>
-      </w:pPr>
-      <w:r>
-        <w:rPr>
-          <w:rFonts w:ascii="Garamond" w:hAnsi="Garamond"/>
-          <w:b/>
-          <w:bCs/>
-          <w:color w:val="000000" w:themeColor="text1"/>
-        </w:rPr>
-        <w:t>Yifat Aran</w:t>
-      </w:r>
-      <w:r>
-        <w:rPr>
-          <w:rFonts w:ascii="Garamond" w:hAnsi="Garamond"/>
-          <w:color w:val="000000" w:themeColor="text1"/>
-        </w:rPr>
-        <w:t xml:space="preserve"> &amp; Raviv Murciano-Goroff, </w:t>
-      </w:r>
-      <w:r>
-        <w:rPr>
-          <w:rFonts w:ascii="Garamond" w:hAnsi="Garamond"/>
-          <w:i/>
-          <w:iCs/>
-          <w:color w:val="000000" w:themeColor="text1"/>
-        </w:rPr>
-        <w:t>When It Comes to Compensation, More Equity Isn’t Always Better</w:t>
-      </w:r>
-      <w:r>
-        <w:rPr>
-          <w:rFonts w:ascii="Garamond" w:hAnsi="Garamond"/>
-          <w:color w:val="000000" w:themeColor="text1"/>
-        </w:rPr>
-        <w:t xml:space="preserve">, </w:t>
-      </w:r>
-      <w:r>
-        <w:rPr>
-          <w:rFonts w:ascii="Garamond" w:hAnsi="Garamond"/>
-          <w:smallCaps/>
-          <w:color w:val="000000" w:themeColor="text1"/>
-        </w:rPr>
-        <w:t>Harvard Business Review</w:t>
-      </w:r>
-      <w:r>
-        <w:rPr>
-          <w:rFonts w:ascii="Garamond" w:hAnsi="Garamond"/>
-          <w:color w:val="000000" w:themeColor="text1"/>
-        </w:rPr>
-        <w:t xml:space="preserve"> (September 12, 2023).</w:t>
+        <w:t>E.U. Stock Option Policy: Time for a Holistic Approach</w:t>
+      </w:r>
+      <w:r>
+        <w:rPr>
+          <w:rFonts w:ascii="Garamond" w:hAnsi="Garamond"/>
+          <w:color w:val="000000" w:themeColor="text1"/>
+        </w:rPr>
+        <w:t>, ECGI Blog (January 10, 2026).</w:t>
       </w:r>
     </w:p>
     <w:p>
@@ -1998,7 +1922,7 @@
           <w:rFonts w:ascii="Garamond" w:hAnsi="Garamond"/>
           <w:color w:val="000000" w:themeColor="text1"/>
         </w:rPr>
-        <w:t xml:space="preserve"> &amp; Elizabeth Pollman, </w:t>
+        <w:t xml:space="preserve"> &amp; Nizan Geslevich Packin, </w:t>
       </w:r>
       <w:r>
         <w:rPr>
@@ -2007,14 +1931,14 @@
           <w:iCs/>
           <w:color w:val="000000" w:themeColor="text1"/>
         </w:rPr>
-        <w:t>Ousted</w:t>
-      </w:r>
-      <w:r>
-        <w:rPr>
-          <w:rFonts w:ascii="Garamond" w:hAnsi="Garamond"/>
-          <w:color w:val="000000" w:themeColor="text1"/>
-        </w:rPr>
-        <w:t>, Harvard Law School Forum on Corporate Governance (November 29, 2023).</w:t>
+        <w:t>When Venture Capital’s Speed Runs Ahead of Its Due Diligence</w:t>
+      </w:r>
+      <w:r>
+        <w:rPr>
+          <w:rFonts w:ascii="Garamond" w:hAnsi="Garamond"/>
+          <w:color w:val="000000" w:themeColor="text1"/>
+        </w:rPr>
+        <w:t>, CLS Blue Sky Blog (July 17, 2025).</w:t>
       </w:r>
     </w:p>
     <w:p>
@@ -2044,7 +1968,7 @@
           <w:rFonts w:ascii="Garamond" w:hAnsi="Garamond"/>
           <w:color w:val="000000" w:themeColor="text1"/>
         </w:rPr>
-        <w:t xml:space="preserve">, </w:t>
+        <w:t xml:space="preserve">, Brian Broughman &amp; Elizabeth Pollman, </w:t>
       </w:r>
       <w:r>
         <w:rPr>
@@ -2053,14 +1977,14 @@
           <w:iCs/>
           <w:color w:val="000000" w:themeColor="text1"/>
         </w:rPr>
-        <w:t>Regulating Startup Equity Compensation in the Unicorn Era</w:t>
-      </w:r>
-      <w:r>
-        <w:rPr>
-          <w:rFonts w:ascii="Garamond" w:hAnsi="Garamond"/>
-          <w:color w:val="000000" w:themeColor="text1"/>
-        </w:rPr>
-        <w:t>, Oxford Business Law Blog (February 5, 2024).</w:t>
+        <w:t>CEO Turnover at Dual-Class Firms</w:t>
+      </w:r>
+      <w:r>
+        <w:rPr>
+          <w:rFonts w:ascii="Garamond" w:hAnsi="Garamond"/>
+          <w:color w:val="000000" w:themeColor="text1"/>
+        </w:rPr>
+        <w:t>, Harvard Law School Forum on Corporate Governance (January 30, 2025).</w:t>
       </w:r>
     </w:p>
     <w:p>
@@ -2090,7 +2014,7 @@
           <w:rFonts w:ascii="Garamond" w:hAnsi="Garamond"/>
           <w:color w:val="000000" w:themeColor="text1"/>
         </w:rPr>
-        <w:t xml:space="preserve">, Brian Broughman &amp; Elizabeth Pollman, </w:t>
+        <w:t xml:space="preserve">, </w:t>
       </w:r>
       <w:r>
         <w:rPr>
@@ -2099,14 +2023,14 @@
           <w:iCs/>
           <w:color w:val="000000" w:themeColor="text1"/>
         </w:rPr>
-        <w:t>CEO Turnover at Dual-Class Firms</w:t>
-      </w:r>
-      <w:r>
-        <w:rPr>
-          <w:rFonts w:ascii="Garamond" w:hAnsi="Garamond"/>
-          <w:color w:val="000000" w:themeColor="text1"/>
-        </w:rPr>
-        <w:t>, Harvard Law School Forum on Corporate Governance (January 30, 2025).</w:t>
+        <w:t>Regulating Startup Equity Compensation in the Unicorn Era</w:t>
+      </w:r>
+      <w:r>
+        <w:rPr>
+          <w:rFonts w:ascii="Garamond" w:hAnsi="Garamond"/>
+          <w:color w:val="000000" w:themeColor="text1"/>
+        </w:rPr>
+        <w:t>, Oxford Business Law Blog (February 5, 2024).</w:t>
       </w:r>
     </w:p>
     <w:p>
@@ -2136,7 +2060,7 @@
           <w:rFonts w:ascii="Garamond" w:hAnsi="Garamond"/>
           <w:color w:val="000000" w:themeColor="text1"/>
         </w:rPr>
-        <w:t xml:space="preserve"> &amp; Nizan Geslevich Packin, </w:t>
+        <w:t xml:space="preserve"> &amp; Elizabeth Pollman, </w:t>
       </w:r>
       <w:r>
         <w:rPr>
@@ -2145,14 +2069,14 @@
           <w:iCs/>
           <w:color w:val="000000" w:themeColor="text1"/>
         </w:rPr>
-        <w:t>When Venture Capital’s Speed Runs Ahead of Its Due Diligence</w:t>
-      </w:r>
-      <w:r>
-        <w:rPr>
-          <w:rFonts w:ascii="Garamond" w:hAnsi="Garamond"/>
-          <w:color w:val="000000" w:themeColor="text1"/>
-        </w:rPr>
-        <w:t>, CLS Blue Sky Blog (July 17, 2025).</w:t>
+        <w:t>Ousted</w:t>
+      </w:r>
+      <w:r>
+        <w:rPr>
+          <w:rFonts w:ascii="Garamond" w:hAnsi="Garamond"/>
+          <w:color w:val="000000" w:themeColor="text1"/>
+        </w:rPr>
+        <w:t>, Harvard Law School Forum on Corporate Governance (November 29, 2023).</w:t>
       </w:r>
     </w:p>
     <w:p>
@@ -2182,7 +2106,7 @@
           <w:rFonts w:ascii="Garamond" w:hAnsi="Garamond"/>
           <w:color w:val="000000" w:themeColor="text1"/>
         </w:rPr>
-        <w:t xml:space="preserve"> &amp; Casimiro Nigro, </w:t>
+        <w:t xml:space="preserve"> &amp; Raviv Murciano-Goroff, </w:t>
       </w:r>
       <w:r>
         <w:rPr>
@@ -2191,14 +2115,29 @@
           <w:iCs/>
           <w:color w:val="000000" w:themeColor="text1"/>
         </w:rPr>
-        <w:t>E.U. Stock Option Policy: Time for a Holistic Approach</w:t>
-      </w:r>
-      <w:r>
-        <w:rPr>
-          <w:rFonts w:ascii="Garamond" w:hAnsi="Garamond"/>
-          <w:color w:val="000000" w:themeColor="text1"/>
-        </w:rPr>
-        <w:t>, ECGI Blog (January 10, 2026).</w:t>
+        <w:t>When It Comes to Compensation, More Equity Isn’t Always Better</w:t>
+      </w:r>
+      <w:r>
+        <w:rPr>
+          <w:rFonts w:ascii="Garamond" w:hAnsi="Garamond"/>
+          <w:color w:val="000000" w:themeColor="text1"/>
+        </w:rPr>
+        <w:t xml:space="preserve">, </w:t>
+      </w:r>
+      <w:r>
+        <w:rPr>
+          <w:rFonts w:ascii="Garamond" w:hAnsi="Garamond"/>
+          <w:smallCaps/>
+          <w:color w:val="000000" w:themeColor="text1"/>
+        </w:rPr>
+        <w:t>Harvard Business Review</w:t>
+      </w:r>
+      <w:r>
+        <w:rPr>
+          <w:rFonts w:ascii="Garamond" w:hAnsi="Garamond"/>
+          <w:color w:val="000000" w:themeColor="text1"/>
+        </w:rPr>
+        <w:t xml:space="preserve"> (September 12, 2023).</w:t>
       </w:r>
     </w:p>
     <w:p>
@@ -2237,14 +2176,60 @@
           <w:iCs/>
           <w:color w:val="000000" w:themeColor="text1"/>
         </w:rPr>
-        <w:t>What Brazil Reveals About the Limits of Venture Capital Contract Transplants</w:t>
-      </w:r>
-      <w:r>
-        <w:rPr>
-          <w:rFonts w:ascii="Garamond" w:hAnsi="Garamond"/>
-          <w:color w:val="000000" w:themeColor="text1"/>
-        </w:rPr>
-        <w:t>, ECGI Blog (April 27, 2026).</w:t>
+        <w:t>A new coalition for “Open Cap Table” presents an opportunity for equity transparency</w:t>
+      </w:r>
+      <w:r>
+        <w:rPr>
+          <w:rFonts w:ascii="Garamond" w:hAnsi="Garamond"/>
+          <w:color w:val="000000" w:themeColor="text1"/>
+        </w:rPr>
+        <w:t>, TechCrunch (August 29, 2021).</w:t>
+      </w:r>
+    </w:p>
+    <w:p>
+      <w:pPr>
+        <w:pStyle w:val="ListParagraph"/>
+        <w:numPr>
+          <w:ilvl w:val="0"/>
+          <w:numId w:val="4"/>
+        </w:numPr>
+        <w:spacing w:after="80"/>
+        <w:rPr>
+          <w:rFonts w:ascii="Garamond" w:hAnsi="Garamond"/>
+          <w:color w:val="000000" w:themeColor="text1"/>
+        </w:rPr>
+      </w:pPr>
+      <w:r>
+        <w:rPr>
+          <w:rFonts w:ascii="Garamond" w:hAnsi="Garamond"/>
+          <w:b/>
+          <w:bCs/>
+          <w:color w:val="000000" w:themeColor="text1"/>
+        </w:rPr>
+        <w:t>Yifat Aran</w:t>
+      </w:r>
+      <w:r>
+        <w:rPr>
+          <w:rFonts w:ascii="Garamond" w:hAnsi="Garamond"/>
+          <w:color w:val="000000" w:themeColor="text1"/>
+        </w:rPr>
+        <w:t xml:space="preserve">, </w:t>
+      </w:r>
+      <w:r>
+        <w:rPr>
+          <w:rFonts w:ascii="Garamond" w:hAnsi="Garamond"/>
+          <w:i/>
+          <w:iCs/>
+          <w:color w:val="000000" w:themeColor="text1"/>
+        </w:rPr>
+        <w:t>The SEC should do more to make startup equity compensation transparent</w:t>
+      </w:r>
+      <w:r>
+        <w:rPr>
+          <w:rFonts w:ascii="Garamond" w:hAnsi="Garamond"/>
+          <w:color w:val="000000" w:themeColor="text1"/>
+        </w:rPr>
+        <w:t>, TechCrunch (April 24, 2021).</w:t>
       </w:r>
     </w:p>
     <w:p>
@@ -2708,7 +2693,7 @@
           <w:bCs/>
           <w:color w:val="000000" w:themeColor="text1"/>
         </w:rPr>
-        <w:t>2016–2018</w:t>
+        <w:t>2017–2018</w:t>
       </w:r>
       <w:r>
         <w:rPr>
@@ -2716,7 +2701,7 @@
           <w:color w:val="000000" w:themeColor="text1"/>
         </w:rPr>
         <w:tab/>
-        <w:t>International Peace Scholarship, P.E.O. International Sisterhood</w:t>
+        <w:t>Silvan Cohen Fund Scholarship, Hebrew University Law School</w:t>
       </w:r>
     </w:p>
     <w:p>
@@ -2738,7 +2723,7 @@
           <w:bCs/>
           <w:color w:val="000000" w:themeColor="text1"/>
         </w:rPr>
-        <w:t>2015–2020</w:t>
+        <w:t>2016–2018</w:t>
       </w:r>
       <w:r>
         <w:rPr>
@@ -2746,7 +2731,7 @@
           <w:color w:val="000000" w:themeColor="text1"/>
         </w:rPr>
         <w:tab/>
-        <w:t>E. David Fischman Scholarship</w:t>
+        <w:t>International Peace Scholarship, P.E.O. International Sisterhood</w:t>
       </w:r>
     </w:p>
     <w:p>
@@ -2768,7 +2753,7 @@
           <w:bCs/>
           <w:color w:val="000000" w:themeColor="text1"/>
         </w:rPr>
-        <w:t>2015</w:t>
+        <w:t>2015–2020</w:t>
       </w:r>
       <w:r>
         <w:rPr>
@@ -2776,7 +2761,7 @@
           <w:color w:val="000000" w:themeColor="text1"/>
         </w:rPr>
         <w:tab/>
-        <w:t>Gerald Gunther Prize for Outstanding Performance in Modern American Legal Thought, Stanford Law School</w:t>
+        <w:t>E. David Fischman Scholarship</w:t>
       </w:r>
     </w:p>
     <w:p>
@@ -2798,7 +2783,7 @@
           <w:bCs/>
           <w:color w:val="000000" w:themeColor="text1"/>
         </w:rPr>
-        <w:t>2014 &amp; 2019</w:t>
+        <w:t>2015</w:t>
       </w:r>
       <w:r>
         <w:rPr>
@@ -2806,7 +2791,7 @@
           <w:color w:val="000000" w:themeColor="text1"/>
         </w:rPr>
         <w:tab/>
-        <w:t>Decalogue Fund Scholarship, Hebrew University Law School</w:t>
+        <w:t>Gerald Gunther Prize for Outstanding Performance in Modern American Legal Thought, Stanford Law School</w:t>
       </w:r>
     </w:p>
     <w:p>
@@ -2858,7 +2843,7 @@
           <w:bCs/>
           <w:color w:val="000000" w:themeColor="text1"/>
         </w:rPr>
-        <w:t>2017–2018</w:t>
+        <w:t>2014 &amp; 2019</w:t>
       </w:r>
       <w:r>
         <w:rPr>
@@ -2866,7 +2851,7 @@
           <w:color w:val="000000" w:themeColor="text1"/>
         </w:rPr>
         <w:tab/>
-        <w:t>Silvan Cohen Fund Scholarship, Hebrew University Law School</w:t>
+        <w:t>Decalogue Fund Scholarship, Hebrew University Law School</w:t>
       </w:r>
     </w:p>
     <w:p>
@@ -3177,14 +3162,37 @@
           <w:bCs/>
           <w:color w:val="000000" w:themeColor="text1"/>
         </w:rPr>
-        <w:t>Corporate Law (Mandatory)</w:t>
-      </w:r>
-      <w:r>
-        <w:rPr>
-          <w:rFonts w:ascii="Garamond" w:hAnsi="Garamond"/>
-          <w:color w:val="000000" w:themeColor="text1"/>
-        </w:rPr>
-        <w:t xml:space="preserve"> (LLB), University of Haifa</w:t>
+        <w:t>Corporate Law in the ESG Era</w:t>
+      </w:r>
+      <w:r>
+        <w:rPr>
+          <w:rFonts w:ascii="Garamond" w:hAnsi="Garamond"/>
+          <w:color w:val="000000" w:themeColor="text1"/>
+        </w:rPr>
+        <w:t xml:space="preserve"> </w:t>
+      </w:r>
+      <w:r>
+        <w:rPr>
+          <w:rFonts w:ascii="Garamond" w:hAnsi="Garamond"/>
+          <w:b/>
+          <w:bCs/>
+          <w:color w:val="000000" w:themeColor="text1"/>
+        </w:rPr>
+        <w:t>(Seminar)</w:t>
+      </w:r>
+      <w:r>
+        <w:rPr>
+          <w:rFonts w:ascii="Garamond" w:hAnsi="Garamond"/>
+          <w:color w:val="000000" w:themeColor="text1"/>
+        </w:rPr>
+        <w:t xml:space="preserve"> </w:t>
+      </w:r>
+      <w:r>
+        <w:rPr>
+          <w:rFonts w:ascii="Garamond" w:hAnsi="Garamond"/>
+          <w:color w:val="000000" w:themeColor="text1"/>
+        </w:rPr>
+        <w:t>(LLM), University of Haifa</w:t>
       </w:r>
       <w:r>
         <w:rPr>
@@ -3192,7 +3200,14 @@
           <w:color w:val="000000" w:themeColor="text1"/>
         </w:rPr>
         <w:tab/>
-        <w:t>2021–present</w:t>
+        <w:t>2023–2026</w:t>
+      </w:r>
+      <w:r>
+        <w:rPr>
+          <w:rFonts w:ascii="Garamond" w:hAnsi="Garamond"/>
+          <w:color w:val="000000" w:themeColor="text1"/>
+        </w:rPr>
+        <w:tab/>
       </w:r>
     </w:p>
     <w:p>
@@ -3292,37 +3307,14 @@
           <w:bCs/>
           <w:color w:val="000000" w:themeColor="text1"/>
         </w:rPr>
-        <w:t>Corporate Law in the ESG Era</w:t>
-      </w:r>
-      <w:r>
-        <w:rPr>
-          <w:rFonts w:ascii="Garamond" w:hAnsi="Garamond"/>
-          <w:color w:val="000000" w:themeColor="text1"/>
-        </w:rPr>
-        <w:t xml:space="preserve"> </w:t>
-      </w:r>
-      <w:r>
-        <w:rPr>
-          <w:rFonts w:ascii="Garamond" w:hAnsi="Garamond"/>
-          <w:b/>
-          <w:bCs/>
-          <w:color w:val="000000" w:themeColor="text1"/>
-        </w:rPr>
-        <w:t>(Seminar)</w:t>
-      </w:r>
-      <w:r>
-        <w:rPr>
-          <w:rFonts w:ascii="Garamond" w:hAnsi="Garamond"/>
-          <w:color w:val="000000" w:themeColor="text1"/>
-        </w:rPr>
-        <w:t xml:space="preserve"> </w:t>
-      </w:r>
-      <w:r>
-        <w:rPr>
-          <w:rFonts w:ascii="Garamond" w:hAnsi="Garamond"/>
-          <w:color w:val="000000" w:themeColor="text1"/>
-        </w:rPr>
-        <w:t>(LLM), University of Haifa</w:t>
+        <w:t>Corporate Law (Mandatory)</w:t>
+      </w:r>
+      <w:r>
+        <w:rPr>
+          <w:rFonts w:ascii="Garamond" w:hAnsi="Garamond"/>
+          <w:color w:val="000000" w:themeColor="text1"/>
+        </w:rPr>
+        <w:t xml:space="preserve"> (LLB), University of Haifa</w:t>
       </w:r>
       <w:r>
         <w:rPr>
@@ -3330,14 +3322,7 @@
           <w:color w:val="000000" w:themeColor="text1"/>
         </w:rPr>
         <w:tab/>
-        <w:t>2023–2026</w:t>
-      </w:r>
-      <w:r>
-        <w:rPr>
-          <w:rFonts w:ascii="Garamond" w:hAnsi="Garamond"/>
-          <w:color w:val="000000" w:themeColor="text1"/>
-        </w:rPr>
-        <w:tab/>
+        <w:t>2021–present</w:t>
       </w:r>
     </w:p>
     <w:p>
@@ -4690,6 +4675,31 @@
           <w:bCs/>
           <w:color w:val="000000" w:themeColor="text1"/>
         </w:rPr>
+        <w:t xml:space="preserve">2022–2024  </w:t>
+      </w:r>
+      <w:r>
+        <w:rPr>
+          <w:rFonts w:ascii="Garamond" w:hAnsi="Garamond"/>
+          <w:color w:val="000000" w:themeColor="text1"/>
+        </w:rPr>
+        <w:t>Oversaw preparation of top candidates for Supreme Court and other competitive positions</w:t>
+      </w:r>
+    </w:p>
+    <w:p>
+      <w:pPr>
+        <w:spacing w:after="50"/>
+        <w:rPr>
+          <w:rFonts w:ascii="Garamond" w:hAnsi="Garamond"/>
+          <w:color w:val="000000" w:themeColor="text1"/>
+        </w:rPr>
+      </w:pPr>
+      <w:r>
+        <w:rPr>
+          <w:rFonts w:ascii="Garamond" w:hAnsi="Garamond"/>
+          <w:b/>
+          <w:bCs/>
+          <w:color w:val="000000" w:themeColor="text1"/>
+        </w:rPr>
         <w:t xml:space="preserve">2021–2024  </w:t>
       </w:r>
       <w:r>
@@ -4698,31 +4708,6 @@
           <w:color w:val="000000" w:themeColor="text1"/>
         </w:rPr>
         <w:t>Member of the Research Authority Council, University of Haifa School of Law</w:t>
-      </w:r>
-    </w:p>
-    <w:p>
-      <w:pPr>
-        <w:spacing w:after="50"/>
-        <w:rPr>
-          <w:rFonts w:ascii="Garamond" w:hAnsi="Garamond"/>
-          <w:color w:val="000000" w:themeColor="text1"/>
-        </w:rPr>
-      </w:pPr>
-      <w:r>
-        <w:rPr>
-          <w:rFonts w:ascii="Garamond" w:hAnsi="Garamond"/>
-          <w:b/>
-          <w:bCs/>
-          <w:color w:val="000000" w:themeColor="text1"/>
-        </w:rPr>
-        <w:t xml:space="preserve">2022–2024  </w:t>
-      </w:r>
-      <w:r>
-        <w:rPr>
-          <w:rFonts w:ascii="Garamond" w:hAnsi="Garamond"/>
-          <w:color w:val="000000" w:themeColor="text1"/>
-        </w:rPr>
-        <w:t>Oversaw preparation of top candidates for Supreme Court and other competitive positions</w:t>
       </w:r>
     </w:p>
     <w:p>
@@ -4758,6 +4743,31 @@
           <w:bCs/>
           <w:color w:val="000000" w:themeColor="text1"/>
         </w:rPr>
+        <w:t xml:space="preserve">2025–present  </w:t>
+      </w:r>
+      <w:r>
+        <w:rPr>
+          <w:rFonts w:ascii="Garamond" w:hAnsi="Garamond"/>
+          <w:color w:val="000000" w:themeColor="text1"/>
+        </w:rPr>
+        <w:t>Fellow, Institute for the Study of Employee Ownership and Profit Sharing, Rutgers University</w:t>
+      </w:r>
+    </w:p>
+    <w:p>
+      <w:pPr>
+        <w:spacing w:after="50"/>
+        <w:rPr>
+          <w:rFonts w:ascii="Garamond" w:hAnsi="Garamond"/>
+          <w:color w:val="000000" w:themeColor="text1"/>
+        </w:rPr>
+      </w:pPr>
+      <w:r>
+        <w:rPr>
+          <w:rFonts w:ascii="Garamond" w:hAnsi="Garamond"/>
+          <w:b/>
+          <w:bCs/>
+          <w:color w:val="000000" w:themeColor="text1"/>
+        </w:rPr>
         <w:t xml:space="preserve">2024–present  </w:t>
       </w:r>
       <w:r>
@@ -4783,14 +4793,14 @@
           <w:bCs/>
           <w:color w:val="000000" w:themeColor="text1"/>
         </w:rPr>
-        <w:t xml:space="preserve">2025–present  </w:t>
-      </w:r>
-      <w:r>
-        <w:rPr>
-          <w:rFonts w:ascii="Garamond" w:hAnsi="Garamond"/>
-          <w:color w:val="000000" w:themeColor="text1"/>
-        </w:rPr>
-        <w:t>Fellow, Institute for the Study of Employee Ownership and Profit Sharing, Rutgers University</w:t>
+        <w:t xml:space="preserve">2024  </w:t>
+      </w:r>
+      <w:r>
+        <w:rPr>
+          <w:rFonts w:ascii="Garamond" w:hAnsi="Garamond"/>
+          <w:color w:val="000000" w:themeColor="text1"/>
+        </w:rPr>
+        <w:t>Member, Global Equity Organization (GEO), Silicon Valley and Middle East branches</w:t>
       </w:r>
     </w:p>
     <w:p>
@@ -4833,6 +4843,31 @@
           <w:bCs/>
           <w:color w:val="000000" w:themeColor="text1"/>
         </w:rPr>
+        <w:t xml:space="preserve">2022–2023  </w:t>
+      </w:r>
+      <w:r>
+        <w:rPr>
+          <w:rFonts w:ascii="Garamond" w:hAnsi="Garamond"/>
+          <w:color w:val="000000" w:themeColor="text1"/>
+        </w:rPr>
+        <w:t>Fellow, Institute for Law and Finance (ILF), Goethe University Frankfurt</w:t>
+      </w:r>
+    </w:p>
+    <w:p>
+      <w:pPr>
+        <w:spacing w:after="50"/>
+        <w:rPr>
+          <w:rFonts w:ascii="Garamond" w:hAnsi="Garamond"/>
+          <w:color w:val="000000" w:themeColor="text1"/>
+        </w:rPr>
+      </w:pPr>
+      <w:r>
+        <w:rPr>
+          <w:rFonts w:ascii="Garamond" w:hAnsi="Garamond"/>
+          <w:b/>
+          <w:bCs/>
+          <w:color w:val="000000" w:themeColor="text1"/>
+        </w:rPr>
         <w:t xml:space="preserve">2021–present  </w:t>
       </w:r>
       <w:r>
@@ -4841,56 +4876,6 @@
           <w:color w:val="000000" w:themeColor="text1"/>
         </w:rPr>
         <w:t>Co-Founder and Co-Chair, “Chaverot” — Israeli Women in Business Law Forum</w:t>
-      </w:r>
-    </w:p>
-    <w:p>
-      <w:pPr>
-        <w:spacing w:after="50"/>
-        <w:rPr>
-          <w:rFonts w:ascii="Garamond" w:hAnsi="Garamond"/>
-          <w:color w:val="000000" w:themeColor="text1"/>
-        </w:rPr>
-      </w:pPr>
-      <w:r>
-        <w:rPr>
-          <w:rFonts w:ascii="Garamond" w:hAnsi="Garamond"/>
-          <w:b/>
-          <w:bCs/>
-          <w:color w:val="000000" w:themeColor="text1"/>
-        </w:rPr>
-        <w:t xml:space="preserve">2022–2023  </w:t>
-      </w:r>
-      <w:r>
-        <w:rPr>
-          <w:rFonts w:ascii="Garamond" w:hAnsi="Garamond"/>
-          <w:color w:val="000000" w:themeColor="text1"/>
-        </w:rPr>
-        <w:t>Fellow, Institute for Law and Finance (ILF), Goethe University Frankfurt</w:t>
-      </w:r>
-    </w:p>
-    <w:p>
-      <w:pPr>
-        <w:spacing w:after="50"/>
-        <w:rPr>
-          <w:rFonts w:ascii="Garamond" w:hAnsi="Garamond"/>
-          <w:color w:val="000000" w:themeColor="text1"/>
-        </w:rPr>
-      </w:pPr>
-      <w:r>
-        <w:rPr>
-          <w:rFonts w:ascii="Garamond" w:hAnsi="Garamond"/>
-          <w:b/>
-          <w:bCs/>
-          <w:color w:val="000000" w:themeColor="text1"/>
-        </w:rPr>
-        <w:t xml:space="preserve">2024  </w:t>
-      </w:r>
-      <w:r>
-        <w:rPr>
-          <w:rFonts w:ascii="Garamond" w:hAnsi="Garamond"/>
-          <w:color w:val="000000" w:themeColor="text1"/>
-        </w:rPr>
-        <w:t>Member, Global Equity Organization (GEO), Silicon Valley and Middle East branches</w:t>
       </w:r>
     </w:p>
     <w:p>

</xml_diff>

<commit_message>
Place JSD and JSM dissertations under their degrees in the CV
Co-Authored-By: Claude Opus 5.5 <noreply@anthropic.com>
</commit_message>
<xml_diff>
--- a/Yifat Aran CV 2026 October 18.docx
+++ b/Yifat Aran CV 2026 October 18.docx
@@ -158,6 +158,32 @@
     </w:p>
     <w:p>
       <w:pPr>
+        <w:spacing w:after="60"/>
+        <w:ind w:left="360"/>
+        <w:rPr>
+          <w:rFonts w:ascii="Garamond" w:hAnsi="Garamond"/>
+          <w:color w:val="000000" w:themeColor="text1"/>
+        </w:rPr>
+      </w:pPr>
+      <w:r>
+        <w:rPr>
+          <w:rFonts w:ascii="Garamond" w:hAnsi="Garamond"/>
+          <w:i/>
+          <w:iCs/>
+          <w:color w:val="000000" w:themeColor="text1"/>
+        </w:rPr>
+        <w:t xml:space="preserve">Dissertation: </w:t>
+      </w:r>
+      <w:r>
+        <w:rPr>
+          <w:rFonts w:ascii="Garamond" w:hAnsi="Garamond"/>
+          <w:color w:val="000000" w:themeColor="text1"/>
+        </w:rPr>
+        <w:t>Securities Regulation Framework for Employee Equity-Based Compensation at Privately Held Firms (Supervisor: Joseph A. Grundfest)</w:t>
+      </w:r>
+    </w:p>
+    <w:p>
+      <w:pPr>
         <w:tabs>
           <w:tab w:val="right" w:pos="9026"/>
         </w:tabs>
@@ -194,6 +220,32 @@
     </w:p>
     <w:p>
       <w:pPr>
+        <w:spacing w:after="60"/>
+        <w:ind w:left="360"/>
+        <w:rPr>
+          <w:rFonts w:ascii="Garamond" w:hAnsi="Garamond"/>
+          <w:color w:val="000000" w:themeColor="text1"/>
+        </w:rPr>
+      </w:pPr>
+      <w:r>
+        <w:rPr>
+          <w:rFonts w:ascii="Garamond" w:hAnsi="Garamond"/>
+          <w:i/>
+          <w:iCs/>
+          <w:color w:val="000000" w:themeColor="text1"/>
+        </w:rPr>
+        <w:t xml:space="preserve">Dissertation: </w:t>
+      </w:r>
+      <w:r>
+        <w:rPr>
+          <w:rFonts w:ascii="Garamond" w:hAnsi="Garamond"/>
+          <w:color w:val="000000" w:themeColor="text1"/>
+        </w:rPr>
+        <w:t>From Delaware to Israel: Evaluating Israel’s Quasi Experiment of a Specialized Corporate Court (Supervisor: Deborah Hensler)</w:t>
+      </w:r>
+    </w:p>
+    <w:p>
+      <w:pPr>
         <w:tabs>
           <w:tab w:val="right" w:pos="9026"/>
         </w:tabs>
@@ -280,31 +332,6 @@
         </w:rPr>
         <w:tab/>
         <w:t>2006–2010</w:t>
-      </w:r>
-    </w:p>
-    <w:p>
-      <w:pPr>
-        <w:spacing w:after="60"/>
-        <w:rPr>
-          <w:rFonts w:ascii="Garamond" w:hAnsi="Garamond"/>
-          <w:color w:val="000000" w:themeColor="text1"/>
-        </w:rPr>
-      </w:pPr>
-      <w:r>
-        <w:rPr>
-          <w:rFonts w:ascii="Garamond" w:hAnsi="Garamond"/>
-          <w:i/>
-          <w:iCs/>
-          <w:color w:val="000000" w:themeColor="text1"/>
-        </w:rPr>
-        <w:t xml:space="preserve">Dissertation: </w:t>
-      </w:r>
-      <w:r>
-        <w:rPr>
-          <w:rFonts w:ascii="Garamond" w:hAnsi="Garamond"/>
-          <w:color w:val="000000" w:themeColor="text1"/>
-        </w:rPr>
-        <w:t>Securities Regulation Framework for Employee Equity-Based Compensation at Privately Held Firms (Supervisor: Joseph A. Grundfest)</w:t>
       </w:r>
     </w:p>
     <w:p>

</xml_diff>

<commit_message>
Correct Abramson & Co. dates to 2011-2016 in the CV
Co-Authored-By: Claude Opus 5.5 <noreply@anthropic.com>
</commit_message>
<xml_diff>
--- a/Yifat Aran CV 2026 October 18.docx
+++ b/Yifat Aran CV 2026 October 18.docx
@@ -582,7 +582,7 @@
           <w:rFonts w:ascii="Garamond" w:hAnsi="Garamond"/>
           <w:color w:val="000000" w:themeColor="text1"/>
         </w:rPr>
-        <w:t xml:space="preserve">Lawyer, Litigation Department, Abramson &amp; Co., Jerusalem</w:t>
+        <w:t xml:space="preserve">Senior Law Clerk to Chief Justice Dr. Asher Grunis, Supreme Court of Israel</w:t>
       </w:r>
       <w:r>
         <w:rPr>
@@ -590,7 +590,7 @@
           <w:color w:val="000000" w:themeColor="text1"/>
         </w:rPr>
         <w:tab/>
-        <w:t>2012–2015</w:t>
+        <w:t>2012</w:t>
       </w:r>
     </w:p>
     <w:p>
@@ -609,7 +609,7 @@
           <w:rFonts w:ascii="Garamond" w:hAnsi="Garamond"/>
           <w:color w:val="000000" w:themeColor="text1"/>
         </w:rPr>
-        <w:t xml:space="preserve">Senior Law Clerk to Chief Justice Dr. Asher Grunis, Supreme Court of Israel</w:t>
+        <w:t xml:space="preserve">Lawyer, Litigation Department, Abramson &amp; Co., Jerusalem</w:t>
       </w:r>
       <w:r>
         <w:rPr>
@@ -617,7 +617,7 @@
           <w:color w:val="000000" w:themeColor="text1"/>
         </w:rPr>
         <w:tab/>
-        <w:t>2012</w:t>
+        <w:t>2011–2016</w:t>
       </w:r>
     </w:p>
     <w:p>

</xml_diff>

<commit_message>
Fit the CV on five pages
Trims top/bottom margins to 0.625" and heading spacing slightly, and
keeps each entry (and its notes) on a single page.

Co-Authored-By: Claude Opus 5.5 <noreply@anthropic.com>
</commit_message>
<xml_diff>
--- a/Yifat Aran CV 2026 October 18.docx
+++ b/Yifat Aran CV 2026 October 18.docx
@@ -122,6 +122,7 @@
     </w:p>
     <w:p>
       <w:pPr>
+        <w:keepLines/>
         <w:tabs>
           <w:tab w:val="right" w:pos="9026"/>
         </w:tabs>
@@ -158,6 +159,7 @@
     </w:p>
     <w:p>
       <w:pPr>
+        <w:keepLines/>
         <w:spacing w:after="60"/>
         <w:ind w:left="360"/>
         <w:rPr>
@@ -184,6 +186,7 @@
     </w:p>
     <w:p>
       <w:pPr>
+        <w:keepLines/>
         <w:tabs>
           <w:tab w:val="right" w:pos="9026"/>
         </w:tabs>
@@ -220,6 +223,7 @@
     </w:p>
     <w:p>
       <w:pPr>
+        <w:keepLines/>
         <w:spacing w:after="60"/>
         <w:ind w:left="360"/>
         <w:rPr>
@@ -246,6 +250,7 @@
     </w:p>
     <w:p>
       <w:pPr>
+        <w:keepLines/>
         <w:tabs>
           <w:tab w:val="right" w:pos="9026"/>
         </w:tabs>
@@ -291,6 +296,7 @@
     </w:p>
     <w:p>
       <w:pPr>
+        <w:keepLines/>
         <w:tabs>
           <w:tab w:val="right" w:pos="9026"/>
         </w:tabs>
@@ -354,6 +360,7 @@
     </w:p>
     <w:p>
       <w:pPr>
+        <w:keepLines/>
         <w:tabs>
           <w:tab w:val="right" w:pos="9026"/>
         </w:tabs>
@@ -390,6 +397,7 @@
     </w:p>
     <w:p>
       <w:pPr>
+        <w:keepLines/>
         <w:tabs>
           <w:tab w:val="right" w:pos="9026"/>
         </w:tabs>
@@ -433,6 +441,7 @@
     </w:p>
     <w:p>
       <w:pPr>
+        <w:keepLines/>
         <w:tabs>
           <w:tab w:val="right" w:pos="9026"/>
         </w:tabs>
@@ -478,6 +487,7 @@
     </w:p>
     <w:p>
       <w:pPr>
+        <w:keepLines/>
         <w:tabs>
           <w:tab w:val="right" w:pos="9026"/>
         </w:tabs>
@@ -514,6 +524,7 @@
     </w:p>
     <w:p>
       <w:pPr>
+        <w:keepLines/>
         <w:tabs>
           <w:tab w:val="right" w:pos="9026"/>
         </w:tabs>
@@ -568,6 +579,7 @@
     </w:p>
     <w:p>
       <w:pPr>
+        <w:keepLines/>
         <w:tabs>
           <w:tab w:val="right" w:pos="9026"/>
         </w:tabs>
@@ -595,6 +607,7 @@
     </w:p>
     <w:p>
       <w:pPr>
+        <w:keepLines/>
         <w:tabs>
           <w:tab w:val="right" w:pos="9026"/>
         </w:tabs>
@@ -622,6 +635,7 @@
     </w:p>
     <w:p>
       <w:pPr>
+        <w:keepLines/>
         <w:tabs>
           <w:tab w:val="right" w:pos="9026"/>
         </w:tabs>
@@ -649,6 +663,7 @@
     </w:p>
     <w:p>
       <w:pPr>
+        <w:keepLines/>
         <w:tabs>
           <w:tab w:val="right" w:pos="9026"/>
         </w:tabs>
@@ -694,6 +709,7 @@
     </w:p>
     <w:p>
       <w:pPr>
+        <w:keepLines/>
         <w:spacing w:after="100"/>
         <w:jc w:val="both"/>
         <w:rPr>
@@ -748,6 +764,7 @@
     <w:p>
       <w:pPr>
         <w:pStyle w:val="ListParagraph"/>
+        <w:keepLines/>
         <w:numPr>
           <w:ilvl w:val="0"/>
           <w:numId w:val="2"/>
@@ -809,6 +826,7 @@
     <w:p>
       <w:pPr>
         <w:pStyle w:val="ListParagraph"/>
+        <w:keepLines/>
         <w:numPr>
           <w:ilvl w:val="0"/>
           <w:numId w:val="2"/>
@@ -869,6 +887,7 @@
     <w:p>
       <w:pPr>
         <w:pStyle w:val="ListParagraph"/>
+        <w:keepLines/>
         <w:numPr>
           <w:ilvl w:val="0"/>
           <w:numId w:val="2"/>
@@ -930,6 +949,7 @@
     <w:p>
       <w:pPr>
         <w:pStyle w:val="ListParagraph"/>
+        <w:keepLines/>
         <w:numPr>
           <w:ilvl w:val="0"/>
           <w:numId w:val="2"/>
@@ -998,6 +1018,7 @@
     <w:p>
       <w:pPr>
         <w:pStyle w:val="ListParagraph"/>
+        <w:keepLines/>
         <w:numPr>
           <w:ilvl w:val="0"/>
           <w:numId w:val="2"/>
@@ -1067,6 +1088,8 @@
     <w:p>
       <w:pPr>
         <w:pStyle w:val="ListParagraph"/>
+        <w:keepNext/>
+        <w:keepLines/>
         <w:numPr>
           <w:ilvl w:val="0"/>
           <w:numId w:val="2"/>
@@ -1127,6 +1150,7 @@
     </w:p>
     <w:p>
       <w:pPr>
+        <w:keepLines/>
         <w:spacing w:after="120"/>
         <w:ind w:left="720"/>
         <w:rPr>
@@ -1149,6 +1173,8 @@
     <w:p>
       <w:pPr>
         <w:pStyle w:val="ListParagraph"/>
+        <w:keepNext/>
+        <w:keepLines/>
         <w:numPr>
           <w:ilvl w:val="0"/>
           <w:numId w:val="2"/>
@@ -1209,6 +1235,7 @@
     </w:p>
     <w:p>
       <w:pPr>
+        <w:keepLines/>
         <w:spacing w:after="120"/>
         <w:ind w:left="720"/>
         <w:rPr>
@@ -1231,6 +1258,8 @@
     <w:p>
       <w:pPr>
         <w:pStyle w:val="ListParagraph"/>
+        <w:keepNext/>
+        <w:keepLines/>
         <w:numPr>
           <w:ilvl w:val="0"/>
           <w:numId w:val="2"/>
@@ -1291,6 +1320,7 @@
     </w:p>
     <w:p>
       <w:pPr>
+        <w:keepLines/>
         <w:spacing w:after="120"/>
         <w:ind w:left="720"/>
         <w:rPr>
@@ -1313,6 +1343,8 @@
     <w:p>
       <w:pPr>
         <w:pStyle w:val="ListParagraph"/>
+        <w:keepNext/>
+        <w:keepLines/>
         <w:numPr>
           <w:ilvl w:val="0"/>
           <w:numId w:val="2"/>
@@ -1373,6 +1405,7 @@
     </w:p>
     <w:p>
       <w:pPr>
+        <w:keepLines/>
         <w:spacing w:after="120"/>
         <w:ind w:left="720"/>
         <w:rPr>
@@ -1395,6 +1428,8 @@
     <w:p>
       <w:pPr>
         <w:pStyle w:val="ListParagraph"/>
+        <w:keepNext/>
+        <w:keepLines/>
         <w:numPr>
           <w:ilvl w:val="0"/>
           <w:numId w:val="2"/>
@@ -1455,6 +1490,7 @@
     </w:p>
     <w:p>
       <w:pPr>
+        <w:keepLines/>
         <w:spacing w:after="120"/>
         <w:ind w:left="720"/>
         <w:rPr>
@@ -1477,6 +1513,8 @@
     <w:p>
       <w:pPr>
         <w:pStyle w:val="ListParagraph"/>
+        <w:keepNext/>
+        <w:keepLines/>
         <w:numPr>
           <w:ilvl w:val="0"/>
           <w:numId w:val="2"/>
@@ -1537,6 +1575,8 @@
     </w:p>
     <w:p>
       <w:pPr>
+        <w:keepNext/>
+        <w:keepLines/>
         <w:spacing w:after="120"/>
         <w:ind w:left="720"/>
         <w:rPr>
@@ -1558,6 +1598,7 @@
     </w:p>
     <w:p>
       <w:pPr>
+        <w:keepLines/>
         <w:spacing w:after="120"/>
         <w:ind w:left="720"/>
         <w:rPr>
@@ -1598,6 +1639,7 @@
     <w:p>
       <w:pPr>
         <w:pStyle w:val="ListParagraph"/>
+        <w:keepLines/>
         <w:numPr>
           <w:ilvl w:val="0"/>
           <w:numId w:val="3"/>
@@ -1659,6 +1701,8 @@
     <w:p>
       <w:pPr>
         <w:pStyle w:val="ListParagraph"/>
+        <w:keepNext/>
+        <w:keepLines/>
         <w:numPr>
           <w:ilvl w:val="0"/>
           <w:numId w:val="3"/>
@@ -1719,6 +1763,7 @@
     </w:p>
     <w:p>
       <w:pPr>
+        <w:keepLines/>
         <w:spacing w:after="120"/>
         <w:ind w:left="720"/>
         <w:rPr>
@@ -1759,6 +1804,7 @@
     <w:p>
       <w:pPr>
         <w:pStyle w:val="ListParagraph"/>
+        <w:keepLines/>
         <w:numPr>
           <w:ilvl w:val="0"/>
           <w:numId w:val="10"/>
@@ -1833,6 +1879,7 @@
     <w:p>
       <w:pPr>
         <w:pStyle w:val="ListParagraph"/>
+        <w:keepLines/>
         <w:numPr>
           <w:ilvl w:val="0"/>
           <w:numId w:val="4"/>
@@ -1879,6 +1926,7 @@
     <w:p>
       <w:pPr>
         <w:pStyle w:val="ListParagraph"/>
+        <w:keepLines/>
         <w:numPr>
           <w:ilvl w:val="0"/>
           <w:numId w:val="4"/>
@@ -1925,6 +1973,7 @@
     <w:p>
       <w:pPr>
         <w:pStyle w:val="ListParagraph"/>
+        <w:keepLines/>
         <w:numPr>
           <w:ilvl w:val="0"/>
           <w:numId w:val="4"/>
@@ -1971,6 +2020,7 @@
     <w:p>
       <w:pPr>
         <w:pStyle w:val="ListParagraph"/>
+        <w:keepLines/>
         <w:numPr>
           <w:ilvl w:val="0"/>
           <w:numId w:val="4"/>
@@ -2017,6 +2067,7 @@
     <w:p>
       <w:pPr>
         <w:pStyle w:val="ListParagraph"/>
+        <w:keepLines/>
         <w:numPr>
           <w:ilvl w:val="0"/>
           <w:numId w:val="4"/>
@@ -2063,6 +2114,7 @@
     <w:p>
       <w:pPr>
         <w:pStyle w:val="ListParagraph"/>
+        <w:keepLines/>
         <w:numPr>
           <w:ilvl w:val="0"/>
           <w:numId w:val="4"/>
@@ -2109,6 +2161,7 @@
     <w:p>
       <w:pPr>
         <w:pStyle w:val="ListParagraph"/>
+        <w:keepLines/>
         <w:numPr>
           <w:ilvl w:val="0"/>
           <w:numId w:val="4"/>
@@ -2170,6 +2223,7 @@
     <w:p>
       <w:pPr>
         <w:pStyle w:val="ListParagraph"/>
+        <w:keepLines/>
         <w:numPr>
           <w:ilvl w:val="0"/>
           <w:numId w:val="4"/>
@@ -2216,6 +2270,7 @@
     <w:p>
       <w:pPr>
         <w:pStyle w:val="ListParagraph"/>
+        <w:keepLines/>
         <w:numPr>
           <w:ilvl w:val="0"/>
           <w:numId w:val="4"/>
@@ -2280,6 +2335,7 @@
     </w:p>
     <w:p>
       <w:pPr>
+        <w:keepLines/>
         <w:tabs>
           <w:tab w:val="left" w:pos="1800"/>
         </w:tabs>
@@ -2310,6 +2366,7 @@
     </w:p>
     <w:p>
       <w:pPr>
+        <w:keepLines/>
         <w:tabs>
           <w:tab w:val="left" w:pos="1800"/>
         </w:tabs>
@@ -2340,6 +2397,7 @@
     </w:p>
     <w:p>
       <w:pPr>
+        <w:keepLines/>
         <w:tabs>
           <w:tab w:val="left" w:pos="1800"/>
         </w:tabs>
@@ -2370,6 +2428,7 @@
     </w:p>
     <w:p>
       <w:pPr>
+        <w:keepLines/>
         <w:tabs>
           <w:tab w:val="left" w:pos="1800"/>
         </w:tabs>
@@ -2400,6 +2459,7 @@
     </w:p>
     <w:p>
       <w:pPr>
+        <w:keepLines/>
         <w:tabs>
           <w:tab w:val="left" w:pos="1800"/>
         </w:tabs>
@@ -2430,6 +2490,7 @@
     </w:p>
     <w:p>
       <w:pPr>
+        <w:keepLines/>
         <w:tabs>
           <w:tab w:val="left" w:pos="1800"/>
         </w:tabs>
@@ -2478,6 +2539,7 @@
     </w:p>
     <w:p>
       <w:pPr>
+        <w:keepLines/>
         <w:tabs>
           <w:tab w:val="left" w:pos="1800"/>
         </w:tabs>
@@ -2553,6 +2615,7 @@
     </w:p>
     <w:p>
       <w:pPr>
+        <w:keepLines/>
         <w:tabs>
           <w:tab w:val="left" w:pos="1800"/>
         </w:tabs>
@@ -2583,6 +2646,7 @@
     </w:p>
     <w:p>
       <w:pPr>
+        <w:keepLines/>
         <w:tabs>
           <w:tab w:val="left" w:pos="1800"/>
         </w:tabs>
@@ -2613,6 +2677,7 @@
     </w:p>
     <w:p>
       <w:pPr>
+        <w:keepLines/>
         <w:tabs>
           <w:tab w:val="left" w:pos="1800"/>
         </w:tabs>
@@ -2643,6 +2708,7 @@
     </w:p>
     <w:p>
       <w:pPr>
+        <w:keepLines/>
         <w:tabs>
           <w:tab w:val="left" w:pos="1800"/>
         </w:tabs>
@@ -2673,6 +2739,7 @@
     </w:p>
     <w:p>
       <w:pPr>
+        <w:keepLines/>
         <w:tabs>
           <w:tab w:val="left" w:pos="1800"/>
         </w:tabs>
@@ -2703,6 +2770,7 @@
     </w:p>
     <w:p>
       <w:pPr>
+        <w:keepLines/>
         <w:tabs>
           <w:tab w:val="left" w:pos="1800"/>
         </w:tabs>
@@ -2733,6 +2801,7 @@
     </w:p>
     <w:p>
       <w:pPr>
+        <w:keepLines/>
         <w:tabs>
           <w:tab w:val="left" w:pos="1800"/>
         </w:tabs>
@@ -2763,6 +2832,7 @@
     </w:p>
     <w:p>
       <w:pPr>
+        <w:keepLines/>
         <w:tabs>
           <w:tab w:val="left" w:pos="1800"/>
         </w:tabs>
@@ -2793,6 +2863,7 @@
     </w:p>
     <w:p>
       <w:pPr>
+        <w:keepLines/>
         <w:tabs>
           <w:tab w:val="left" w:pos="1800"/>
         </w:tabs>
@@ -2823,6 +2894,7 @@
     </w:p>
     <w:p>
       <w:pPr>
+        <w:keepLines/>
         <w:tabs>
           <w:tab w:val="left" w:pos="1800"/>
         </w:tabs>
@@ -2853,6 +2925,7 @@
     </w:p>
     <w:p>
       <w:pPr>
+        <w:keepLines/>
         <w:tabs>
           <w:tab w:val="left" w:pos="1800"/>
         </w:tabs>
@@ -2883,6 +2956,7 @@
     </w:p>
     <w:p>
       <w:pPr>
+        <w:keepLines/>
         <w:tabs>
           <w:tab w:val="left" w:pos="1800"/>
         </w:tabs>
@@ -2913,6 +2987,7 @@
     </w:p>
     <w:p>
       <w:pPr>
+        <w:keepLines/>
         <w:tabs>
           <w:tab w:val="left" w:pos="1800"/>
         </w:tabs>
@@ -2943,6 +3018,7 @@
     </w:p>
     <w:p>
       <w:pPr>
+        <w:keepLines/>
         <w:tabs>
           <w:tab w:val="left" w:pos="1800"/>
         </w:tabs>
@@ -2991,6 +3067,7 @@
     </w:p>
     <w:p>
       <w:pPr>
+        <w:keepLines/>
         <w:spacing w:after="80"/>
         <w:rPr>
           <w:rFonts w:ascii="Garamond" w:hAnsi="Garamond"/>
@@ -3032,6 +3109,7 @@
     </w:p>
     <w:p>
       <w:pPr>
+        <w:keepLines/>
         <w:spacing w:after="80"/>
         <w:rPr>
           <w:rFonts w:ascii="Garamond" w:hAnsi="Garamond"/>
@@ -3073,6 +3151,7 @@
     </w:p>
     <w:p>
       <w:pPr>
+        <w:keepLines/>
         <w:spacing w:after="80"/>
         <w:rPr>
           <w:rFonts w:ascii="Garamond" w:hAnsi="Garamond"/>
@@ -3114,6 +3193,7 @@
     </w:p>
     <w:p>
       <w:pPr>
+        <w:keepLines/>
         <w:spacing w:after="80"/>
         <w:rPr>
           <w:rFonts w:ascii="Garamond" w:hAnsi="Garamond"/>
@@ -3173,6 +3253,8 @@
     </w:p>
     <w:p>
       <w:pPr>
+        <w:keepNext/>
+        <w:keepLines/>
         <w:tabs>
           <w:tab w:val="right" w:pos="9026"/>
         </w:tabs>
@@ -3239,6 +3321,8 @@
     </w:p>
     <w:p>
       <w:pPr>
+        <w:keepNext/>
+        <w:keepLines/>
         <w:tabs>
           <w:tab w:val="right" w:pos="9026"/>
         </w:tabs>
@@ -3282,6 +3366,8 @@
     </w:p>
     <w:p>
       <w:pPr>
+        <w:keepNext/>
+        <w:keepLines/>
         <w:tabs>
           <w:tab w:val="right" w:pos="9026"/>
         </w:tabs>
@@ -3318,6 +3404,7 @@
     </w:p>
     <w:p>
       <w:pPr>
+        <w:keepLines/>
         <w:tabs>
           <w:tab w:val="right" w:pos="9026"/>
         </w:tabs>
@@ -3391,6 +3478,7 @@
     </w:p>
     <w:p>
       <w:pPr>
+        <w:keepLines/>
         <w:spacing w:after="50"/>
         <w:rPr>
           <w:rFonts w:ascii="Garamond" w:hAnsi="Garamond"/>
@@ -3416,6 +3504,7 @@
     </w:p>
     <w:p>
       <w:pPr>
+        <w:keepLines/>
         <w:spacing w:after="50"/>
         <w:rPr>
           <w:rFonts w:ascii="Garamond" w:hAnsi="Garamond"/>
@@ -3441,6 +3530,7 @@
     </w:p>
     <w:p>
       <w:pPr>
+        <w:keepLines/>
         <w:spacing w:after="50"/>
         <w:rPr>
           <w:rFonts w:ascii="Garamond" w:hAnsi="Garamond"/>
@@ -3466,6 +3556,7 @@
     </w:p>
     <w:p>
       <w:pPr>
+        <w:keepLines/>
         <w:spacing w:after="50"/>
         <w:rPr>
           <w:rFonts w:ascii="Garamond" w:hAnsi="Garamond"/>
@@ -3491,6 +3582,7 @@
     </w:p>
     <w:p>
       <w:pPr>
+        <w:keepLines/>
         <w:spacing w:after="50"/>
         <w:rPr>
           <w:rFonts w:ascii="Garamond" w:hAnsi="Garamond"/>
@@ -3516,6 +3608,7 @@
     </w:p>
     <w:p>
       <w:pPr>
+        <w:keepLines/>
         <w:spacing w:after="50"/>
         <w:rPr>
           <w:rFonts w:ascii="Garamond" w:hAnsi="Garamond"/>
@@ -3541,6 +3634,7 @@
     </w:p>
     <w:p>
       <w:pPr>
+        <w:keepLines/>
         <w:spacing w:after="50"/>
         <w:rPr>
           <w:rFonts w:ascii="Garamond" w:hAnsi="Garamond"/>
@@ -3566,6 +3660,7 @@
     </w:p>
     <w:p>
       <w:pPr>
+        <w:keepLines/>
         <w:spacing w:after="50"/>
         <w:rPr>
           <w:rFonts w:ascii="Garamond" w:hAnsi="Garamond"/>
@@ -3591,6 +3686,7 @@
     </w:p>
     <w:p>
       <w:pPr>
+        <w:keepLines/>
         <w:spacing w:after="50"/>
         <w:rPr>
           <w:rFonts w:ascii="Garamond" w:hAnsi="Garamond"/>
@@ -3634,6 +3730,7 @@
     </w:p>
     <w:p>
       <w:pPr>
+        <w:keepLines/>
         <w:spacing w:after="50"/>
         <w:rPr>
           <w:rFonts w:ascii="Garamond" w:hAnsi="Garamond"/>
@@ -3659,6 +3756,7 @@
     </w:p>
     <w:p>
       <w:pPr>
+        <w:keepLines/>
         <w:spacing w:after="50"/>
         <w:rPr>
           <w:rFonts w:ascii="Garamond" w:hAnsi="Garamond"/>
@@ -3684,6 +3782,7 @@
     </w:p>
     <w:p>
       <w:pPr>
+        <w:keepLines/>
         <w:spacing w:after="50"/>
         <w:rPr>
           <w:rFonts w:ascii="Garamond" w:hAnsi="Garamond"/>
@@ -3709,6 +3808,7 @@
     </w:p>
     <w:p>
       <w:pPr>
+        <w:keepLines/>
         <w:spacing w:after="50"/>
         <w:rPr>
           <w:rFonts w:ascii="Garamond" w:hAnsi="Garamond"/>
@@ -3734,6 +3834,7 @@
     </w:p>
     <w:p>
       <w:pPr>
+        <w:keepLines/>
         <w:spacing w:after="50"/>
         <w:rPr>
           <w:rFonts w:ascii="Garamond" w:hAnsi="Garamond"/>
@@ -3759,6 +3860,7 @@
     </w:p>
     <w:p>
       <w:pPr>
+        <w:keepLines/>
         <w:spacing w:after="50"/>
         <w:rPr>
           <w:rFonts w:ascii="Garamond" w:hAnsi="Garamond"/>
@@ -3784,6 +3886,7 @@
     </w:p>
     <w:p>
       <w:pPr>
+        <w:keepLines/>
         <w:spacing w:after="50"/>
         <w:rPr>
           <w:rFonts w:ascii="Garamond" w:hAnsi="Garamond"/>
@@ -3809,6 +3912,7 @@
     </w:p>
     <w:p>
       <w:pPr>
+        <w:keepLines/>
         <w:spacing w:after="50"/>
         <w:rPr>
           <w:rFonts w:ascii="Garamond" w:hAnsi="Garamond"/>
@@ -3834,6 +3938,7 @@
     </w:p>
     <w:p>
       <w:pPr>
+        <w:keepLines/>
         <w:spacing w:after="50"/>
         <w:rPr>
           <w:rFonts w:ascii="Garamond" w:hAnsi="Garamond"/>
@@ -3859,6 +3964,7 @@
     </w:p>
     <w:p>
       <w:pPr>
+        <w:keepLines/>
         <w:spacing w:after="50"/>
         <w:rPr>
           <w:rFonts w:ascii="Garamond" w:hAnsi="Garamond"/>
@@ -3884,6 +3990,7 @@
     </w:p>
     <w:p>
       <w:pPr>
+        <w:keepLines/>
         <w:spacing w:after="50"/>
         <w:rPr>
           <w:rFonts w:ascii="Garamond" w:hAnsi="Garamond"/>
@@ -3909,6 +4016,7 @@
     </w:p>
     <w:p>
       <w:pPr>
+        <w:keepLines/>
         <w:spacing w:after="50"/>
         <w:rPr>
           <w:rFonts w:ascii="Garamond" w:hAnsi="Garamond"/>
@@ -3934,6 +4042,7 @@
     </w:p>
     <w:p>
       <w:pPr>
+        <w:keepLines/>
         <w:spacing w:after="50"/>
         <w:rPr>
           <w:rFonts w:ascii="Garamond" w:hAnsi="Garamond"/>
@@ -3959,6 +4068,7 @@
     </w:p>
     <w:p>
       <w:pPr>
+        <w:keepLines/>
         <w:spacing w:after="50"/>
         <w:rPr>
           <w:rFonts w:ascii="Garamond" w:hAnsi="Garamond"/>
@@ -3984,6 +4094,7 @@
     </w:p>
     <w:p>
       <w:pPr>
+        <w:keepLines/>
         <w:spacing w:after="50"/>
         <w:rPr>
           <w:rFonts w:ascii="Garamond" w:hAnsi="Garamond"/>
@@ -4009,6 +4120,7 @@
     </w:p>
     <w:p>
       <w:pPr>
+        <w:keepLines/>
         <w:spacing w:after="50"/>
         <w:rPr>
           <w:rFonts w:ascii="Garamond" w:hAnsi="Garamond"/>
@@ -4034,6 +4146,7 @@
     </w:p>
     <w:p>
       <w:pPr>
+        <w:keepLines/>
         <w:spacing w:after="50"/>
         <w:rPr>
           <w:rFonts w:ascii="Garamond" w:hAnsi="Garamond"/>
@@ -4059,6 +4172,7 @@
     </w:p>
     <w:p>
       <w:pPr>
+        <w:keepLines/>
         <w:spacing w:after="50"/>
         <w:rPr>
           <w:rFonts w:ascii="Garamond" w:hAnsi="Garamond"/>
@@ -4084,6 +4198,7 @@
     </w:p>
     <w:p>
       <w:pPr>
+        <w:keepLines/>
         <w:spacing w:after="50"/>
         <w:rPr>
           <w:rFonts w:ascii="Garamond" w:hAnsi="Garamond"/>
@@ -4109,6 +4224,7 @@
     </w:p>
     <w:p>
       <w:pPr>
+        <w:keepLines/>
         <w:spacing w:after="50"/>
         <w:rPr>
           <w:rFonts w:ascii="Garamond" w:hAnsi="Garamond"/>
@@ -4134,6 +4250,7 @@
     </w:p>
     <w:p>
       <w:pPr>
+        <w:keepLines/>
         <w:spacing w:after="50"/>
         <w:rPr>
           <w:rFonts w:ascii="Garamond" w:hAnsi="Garamond"/>
@@ -4177,6 +4294,7 @@
     </w:p>
     <w:p>
       <w:pPr>
+        <w:keepLines/>
         <w:spacing w:after="50"/>
         <w:rPr>
           <w:rFonts w:ascii="Garamond" w:hAnsi="Garamond"/>
@@ -4202,6 +4320,7 @@
     </w:p>
     <w:p>
       <w:pPr>
+        <w:keepLines/>
         <w:spacing w:after="50"/>
         <w:rPr>
           <w:rFonts w:ascii="Garamond" w:hAnsi="Garamond"/>
@@ -4227,6 +4346,7 @@
     </w:p>
     <w:p>
       <w:pPr>
+        <w:keepLines/>
         <w:spacing w:after="50"/>
         <w:rPr>
           <w:rFonts w:ascii="Garamond" w:hAnsi="Garamond"/>
@@ -4252,6 +4372,7 @@
     </w:p>
     <w:p>
       <w:pPr>
+        <w:keepLines/>
         <w:spacing w:after="50"/>
         <w:rPr>
           <w:rFonts w:ascii="Garamond" w:hAnsi="Garamond"/>
@@ -4277,6 +4398,7 @@
     </w:p>
     <w:p>
       <w:pPr>
+        <w:keepLines/>
         <w:spacing w:after="50"/>
         <w:rPr>
           <w:rFonts w:ascii="Garamond" w:hAnsi="Garamond"/>
@@ -4302,6 +4424,7 @@
     </w:p>
     <w:p>
       <w:pPr>
+        <w:keepLines/>
         <w:spacing w:after="50"/>
         <w:rPr>
           <w:rFonts w:ascii="Garamond" w:hAnsi="Garamond"/>
@@ -4327,6 +4450,7 @@
     </w:p>
     <w:p>
       <w:pPr>
+        <w:keepLines/>
         <w:spacing w:after="50"/>
         <w:rPr>
           <w:rFonts w:ascii="Garamond" w:hAnsi="Garamond"/>
@@ -4352,6 +4476,7 @@
     </w:p>
     <w:p>
       <w:pPr>
+        <w:keepLines/>
         <w:spacing w:after="50"/>
         <w:rPr>
           <w:rFonts w:ascii="Garamond" w:hAnsi="Garamond"/>
@@ -4377,6 +4502,7 @@
     </w:p>
     <w:p>
       <w:pPr>
+        <w:keepLines/>
         <w:spacing w:after="50"/>
         <w:rPr>
           <w:rFonts w:ascii="Garamond" w:hAnsi="Garamond"/>
@@ -4402,6 +4528,7 @@
     </w:p>
     <w:p>
       <w:pPr>
+        <w:keepLines/>
         <w:spacing w:after="50"/>
         <w:rPr>
           <w:rFonts w:ascii="Garamond" w:hAnsi="Garamond"/>
@@ -4427,6 +4554,7 @@
     </w:p>
     <w:p>
       <w:pPr>
+        <w:keepLines/>
         <w:spacing w:after="50"/>
         <w:rPr>
           <w:rFonts w:ascii="Garamond" w:hAnsi="Garamond"/>
@@ -4452,6 +4580,7 @@
     </w:p>
     <w:p>
       <w:pPr>
+        <w:keepLines/>
         <w:spacing w:after="50"/>
         <w:rPr>
           <w:rFonts w:ascii="Garamond" w:hAnsi="Garamond"/>
@@ -4477,6 +4606,7 @@
     </w:p>
     <w:p>
       <w:pPr>
+        <w:keepLines/>
         <w:spacing w:after="50"/>
         <w:rPr>
           <w:rFonts w:ascii="Garamond" w:hAnsi="Garamond"/>
@@ -4502,6 +4632,7 @@
     </w:p>
     <w:p>
       <w:pPr>
+        <w:keepLines/>
         <w:spacing w:after="50"/>
         <w:rPr>
           <w:rFonts w:ascii="Garamond" w:hAnsi="Garamond"/>
@@ -4527,6 +4658,7 @@
     </w:p>
     <w:p>
       <w:pPr>
+        <w:keepLines/>
         <w:spacing w:after="50"/>
         <w:rPr>
           <w:rFonts w:ascii="Garamond" w:hAnsi="Garamond"/>
@@ -4552,6 +4684,7 @@
     </w:p>
     <w:p>
       <w:pPr>
+        <w:keepLines/>
         <w:spacing w:after="50"/>
         <w:rPr>
           <w:rFonts w:ascii="Garamond" w:hAnsi="Garamond"/>
@@ -4614,6 +4747,7 @@
     </w:p>
     <w:p>
       <w:pPr>
+        <w:keepLines/>
         <w:spacing w:after="50"/>
         <w:rPr>
           <w:rFonts w:ascii="Garamond" w:hAnsi="Garamond"/>
@@ -4639,6 +4773,7 @@
     </w:p>
     <w:p>
       <w:pPr>
+        <w:keepLines/>
         <w:spacing w:after="50"/>
         <w:rPr>
           <w:rFonts w:ascii="Garamond" w:hAnsi="Garamond"/>
@@ -4664,6 +4799,7 @@
     </w:p>
     <w:p>
       <w:pPr>
+        <w:keepLines/>
         <w:spacing w:after="50"/>
         <w:rPr>
           <w:rFonts w:ascii="Garamond" w:hAnsi="Garamond"/>
@@ -4689,6 +4825,7 @@
     </w:p>
     <w:p>
       <w:pPr>
+        <w:keepLines/>
         <w:spacing w:after="50"/>
         <w:rPr>
           <w:rFonts w:ascii="Garamond" w:hAnsi="Garamond"/>
@@ -4714,6 +4851,7 @@
     </w:p>
     <w:p>
       <w:pPr>
+        <w:keepLines/>
         <w:spacing w:after="50"/>
         <w:rPr>
           <w:rFonts w:ascii="Garamond" w:hAnsi="Garamond"/>
@@ -4757,6 +4895,7 @@
     </w:p>
     <w:p>
       <w:pPr>
+        <w:keepLines/>
         <w:spacing w:after="50"/>
         <w:rPr>
           <w:rFonts w:ascii="Garamond" w:hAnsi="Garamond"/>
@@ -4782,6 +4921,7 @@
     </w:p>
     <w:p>
       <w:pPr>
+        <w:keepLines/>
         <w:spacing w:after="50"/>
         <w:rPr>
           <w:rFonts w:ascii="Garamond" w:hAnsi="Garamond"/>
@@ -4807,6 +4947,7 @@
     </w:p>
     <w:p>
       <w:pPr>
+        <w:keepLines/>
         <w:spacing w:after="50"/>
         <w:rPr>
           <w:rFonts w:ascii="Garamond" w:hAnsi="Garamond"/>
@@ -4832,6 +4973,7 @@
     </w:p>
     <w:p>
       <w:pPr>
+        <w:keepLines/>
         <w:spacing w:after="50"/>
         <w:rPr>
           <w:rFonts w:ascii="Garamond" w:hAnsi="Garamond"/>
@@ -4857,6 +4999,7 @@
     </w:p>
     <w:p>
       <w:pPr>
+        <w:keepLines/>
         <w:spacing w:after="50"/>
         <w:rPr>
           <w:rFonts w:ascii="Garamond" w:hAnsi="Garamond"/>
@@ -4882,6 +5025,7 @@
     </w:p>
     <w:p>
       <w:pPr>
+        <w:keepLines/>
         <w:spacing w:after="50"/>
         <w:rPr>
           <w:rFonts w:ascii="Garamond" w:hAnsi="Garamond"/>
@@ -4907,6 +5051,7 @@
     </w:p>
     <w:p>
       <w:pPr>
+        <w:keepLines/>
         <w:spacing w:after="50"/>
         <w:rPr>
           <w:rFonts w:ascii="Garamond" w:hAnsi="Garamond"/>
@@ -4950,6 +5095,7 @@
     </w:p>
     <w:p>
       <w:pPr>
+        <w:keepLines/>
         <w:spacing w:after="50"/>
         <w:rPr>
           <w:rFonts w:ascii="Garamond" w:hAnsi="Garamond"/>
@@ -4975,6 +5121,7 @@
     </w:p>
     <w:p>
       <w:pPr>
+        <w:keepLines/>
         <w:spacing w:after="50"/>
         <w:rPr>
           <w:rFonts w:ascii="Garamond" w:hAnsi="Garamond"/>
@@ -5000,6 +5147,7 @@
     </w:p>
     <w:p>
       <w:pPr>
+        <w:keepLines/>
         <w:spacing w:after="50"/>
         <w:rPr>
           <w:rFonts w:ascii="Garamond" w:hAnsi="Garamond"/>
@@ -5025,6 +5173,7 @@
     </w:p>
     <w:p>
       <w:pPr>
+        <w:keepLines/>
         <w:spacing w:after="50"/>
         <w:rPr>
           <w:rFonts w:ascii="Garamond" w:hAnsi="Garamond"/>
@@ -5050,6 +5199,7 @@
     </w:p>
     <w:p>
       <w:pPr>
+        <w:keepLines/>
         <w:spacing w:after="50"/>
         <w:rPr>
           <w:rFonts w:ascii="Garamond" w:hAnsi="Garamond"/>
@@ -5075,6 +5225,7 @@
     </w:p>
     <w:p>
       <w:pPr>
+        <w:keepLines/>
         <w:spacing w:after="50"/>
         <w:rPr>
           <w:rFonts w:ascii="Garamond" w:hAnsi="Garamond"/>
@@ -5100,6 +5251,7 @@
     </w:p>
     <w:p>
       <w:pPr>
+        <w:keepLines/>
         <w:spacing w:after="50"/>
         <w:rPr>
           <w:rFonts w:ascii="Garamond" w:hAnsi="Garamond"/>
@@ -5125,6 +5277,7 @@
     </w:p>
     <w:p>
       <w:pPr>
+        <w:keepLines/>
         <w:spacing w:after="50"/>
         <w:rPr>
           <w:rFonts w:ascii="Garamond" w:hAnsi="Garamond"/>
@@ -5150,6 +5303,7 @@
     </w:p>
     <w:p>
       <w:pPr>
+        <w:keepLines/>
         <w:spacing w:after="50"/>
         <w:rPr>
           <w:rFonts w:ascii="Garamond" w:hAnsi="Garamond"/>
@@ -5175,6 +5329,7 @@
     </w:p>
     <w:p>
       <w:pPr>
+        <w:keepLines/>
         <w:spacing w:after="50"/>
         <w:rPr>
           <w:rFonts w:ascii="Garamond" w:hAnsi="Garamond"/>
@@ -5200,6 +5355,7 @@
     </w:p>
     <w:p>
       <w:pPr>
+        <w:keepLines/>
         <w:spacing w:after="50"/>
         <w:rPr>
           <w:rFonts w:ascii="Garamond" w:hAnsi="Garamond"/>
@@ -5225,6 +5381,7 @@
     </w:p>
     <w:p>
       <w:pPr>
+        <w:keepLines/>
         <w:spacing w:after="50"/>
         <w:rPr>
           <w:rFonts w:ascii="Garamond" w:hAnsi="Garamond"/>
@@ -5250,6 +5407,7 @@
     </w:p>
     <w:p>
       <w:pPr>
+        <w:keepLines/>
         <w:spacing w:after="50"/>
         <w:rPr>
           <w:rFonts w:ascii="Garamond" w:hAnsi="Garamond"/>
@@ -5275,6 +5433,7 @@
     </w:p>
     <w:p>
       <w:pPr>
+        <w:keepLines/>
         <w:spacing w:after="50"/>
         <w:rPr>
           <w:rFonts w:ascii="Garamond" w:hAnsi="Garamond"/>
@@ -5318,6 +5477,7 @@
     </w:p>
     <w:p>
       <w:pPr>
+        <w:keepLines/>
         <w:spacing w:after="120"/>
         <w:ind w:left="720"/>
         <w:rPr>
@@ -5341,7 +5501,7 @@
       <w:headerReference w:type="default" r:id="rId9"/>
       <w:footerReference w:type="default" r:id="rId10"/>
       <w:pgSz w:w="11906" w:h="16838"/>
-      <w:pgMar w:top="1080" w:right="1080" w:bottom="1080" w:left="1080" w:header="708" w:footer="708" w:gutter="0"/>
+      <w:pgMar w:top="900" w:right="1080" w:bottom="900" w:left="1080" w:header="520" w:footer="520" w:gutter="0"/>
       <w:pgNumType w:start="1"/>
       <w:cols w:space="720"/>
       <w:docGrid w:linePitch="360"/>
@@ -6581,7 +6741,7 @@
       <w:pBdr>
         <w:bottom w:val="single" w:sz="1" w:space="0" w:color="2C3E50"/>
       </w:pBdr>
-      <w:spacing w:before="360" w:after="120"/>
+      <w:spacing w:before="300" w:after="120"/>
       <w:outlineLvl w:val="0"/>
     </w:pPr>
     <w:rPr>
@@ -6599,7 +6759,7 @@
     <w:unhideWhenUsed/>
     <w:qFormat/>
     <w:pPr>
-      <w:spacing w:before="240" w:after="100"/>
+      <w:spacing w:before="200" w:after="100"/>
       <w:outlineLvl w:val="1"/>
     </w:pPr>
     <w:rPr>

</xml_diff>